<commit_message>
Deploying to gh-pages from @ Morrison-Lab/rme@bc31093b1b58d8125f31d9bc678743df4761af49 🚀
</commit_message>
<xml_diff>
--- a/chapters/count-regression-handout.docx
+++ b/chapters/count-regression-handout.docx
@@ -39407,7 +39407,7 @@
               <w:rPr>
                 <w:rStyle w:val="CommentTok"/>
               </w:rPr>
-              <w:t xml:space="preserve">#&gt;     hivstat + sexabuse + hplsns, data = needles, init.theta = 0.0903642555, </w:t>
+              <w:t xml:space="preserve">#&gt;     hivstat + sexabuse + hplsns, data = needles, init.theta = 0.08315440712, </w:t>
             </w:r>
             <w:r>
               <w:br/>
@@ -39443,7 +39443,7 @@
               <w:rPr>
                 <w:rStyle w:val="CommentTok"/>
               </w:rPr>
-              <w:t xml:space="preserve">#&gt;                             Estimate Std. Error z value Pr(&gt;|z|)   </w:t>
+              <w:t xml:space="preserve">#&gt;                             Estimate Std. Error z value Pr(&gt;|z|)    </w:t>
             </w:r>
             <w:r>
               <w:br/>
@@ -39452,7 +39452,7 @@
               <w:rPr>
                 <w:rStyle w:val="CommentTok"/>
               </w:rPr>
-              <w:t xml:space="preserve">#&gt; (Intercept)                   2.8948     1.9293    1.50   0.1335   </w:t>
+              <w:t xml:space="preserve">#&gt; (Intercept)                   6.4536     1.8421    3.50  0.00046 ***</w:t>
             </w:r>
             <w:r>
               <w:br/>
@@ -39461,7 +39461,7 @@
               <w:rPr>
                 <w:rStyle w:val="CommentTok"/>
               </w:rPr>
-              <w:t xml:space="preserve">#&gt; homelesshomeless              2.5534     0.8024    3.18   0.0015 **</w:t>
+              <w:t xml:space="preserve">#&gt; homelesshomeless              1.1508     0.7366    1.56  0.11820    </w:t>
             </w:r>
             <w:r>
               <w:br/>
@@ -39470,7 +39470,7 @@
               <w:rPr>
                 <w:rStyle w:val="CommentTok"/>
               </w:rPr>
-              <w:t xml:space="preserve">#&gt; age                          -0.0729     0.0447   -1.63   0.1027   </w:t>
+              <w:t xml:space="preserve">#&gt; age                          -0.1485     0.0433   -3.43  0.00059 ***</w:t>
             </w:r>
             <w:r>
               <w:br/>
@@ -39479,7 +39479,7 @@
               <w:rPr>
                 <w:rStyle w:val="CommentTok"/>
               </w:rPr>
-              <w:t xml:space="preserve">#&gt; sexF                         -0.5545     0.8869   -0.63   0.5318   </w:t>
+              <w:t xml:space="preserve">#&gt; sexF                          0.2198     0.8179    0.27  0.78813    </w:t>
             </w:r>
             <w:r>
               <w:br/>
@@ -39488,7 +39488,7 @@
               <w:rPr>
                 <w:rStyle w:val="CommentTok"/>
               </w:rPr>
-              <w:t xml:space="preserve">#&gt; ethnAA                        0.9100     0.9416    0.97   0.3339   </w:t>
+              <w:t xml:space="preserve">#&gt; ethnAA                        1.5958     0.8890    1.79  0.07265 .  </w:t>
             </w:r>
             <w:r>
               <w:br/>
@@ -39497,7 +39497,7 @@
               <w:rPr>
                 <w:rStyle w:val="CommentTok"/>
               </w:rPr>
-              <w:t xml:space="preserve">#&gt; ethnHispanic                  2.6222     1.5835    1.66   0.0977 . </w:t>
+              <w:t xml:space="preserve">#&gt; ethnHispanic                  3.7763     1.5240    2.48  0.01322 *  </w:t>
             </w:r>
             <w:r>
               <w:br/>
@@ -39506,7 +39506,7 @@
               <w:rPr>
                 <w:rStyle w:val="CommentTok"/>
               </w:rPr>
-              <w:t xml:space="preserve">#&gt; ethnOther                    -1.5963     2.1745   -0.73   0.4629   </w:t>
+              <w:t xml:space="preserve">#&gt; ethnOther                    -3.2365     2.2663   -1.43  0.15327    </w:t>
             </w:r>
             <w:r>
               <w:br/>
@@ -39515,7 +39515,7 @@
               <w:rPr>
                 <w:rStyle w:val="CommentTok"/>
               </w:rPr>
-              <w:t xml:space="preserve">#&gt; polydrugmultiple drugs used  -3.7062     1.3330   -2.78   0.0054 **</w:t>
+              <w:t xml:space="preserve">#&gt; polydrugmultiple drugs used  -4.0532     1.0898   -3.72  0.00020 ***</w:t>
             </w:r>
             <w:r>
               <w:br/>
@@ -39524,7 +39524,7 @@
               <w:rPr>
                 <w:rStyle w:val="CommentTok"/>
               </w:rPr>
-              <w:t xml:space="preserve">#&gt; hivstatHIV+                  -3.4809     1.5036   -2.32   0.0206 * </w:t>
+              <w:t xml:space="preserve">#&gt; hivstatHIV+                  -1.1548     1.3185   -0.88  0.38113    </w:t>
             </w:r>
             <w:r>
               <w:br/>
@@ -39533,7 +39533,7 @@
               <w:rPr>
                 <w:rStyle w:val="CommentTok"/>
               </w:rPr>
-              <w:t xml:space="preserve">#&gt; sexabuseyes                  -1.5612     1.2484   -1.25   0.2111   </w:t>
+              <w:t xml:space="preserve">#&gt; sexabuseyes                  -2.6449     1.0772   -2.46  0.01408 *  </w:t>
             </w:r>
             <w:r>
               <w:br/>
@@ -39542,7 +39542,7 @@
               <w:rPr>
                 <w:rStyle w:val="CommentTok"/>
               </w:rPr>
-              <w:t xml:space="preserve">#&gt; hplsns                       -0.0449     0.0685   -0.66   0.5119   </w:t>
+              <w:t xml:space="preserve">#&gt; hplsns                        0.0948     0.0648    1.46  0.14306    </w:t>
             </w:r>
             <w:r>
               <w:br/>
@@ -39578,7 +39578,7 @@
               <w:rPr>
                 <w:rStyle w:val="CommentTok"/>
               </w:rPr>
-              <w:t xml:space="preserve">#&gt; (Dispersion parameter for Negative Binomial(0.0899) family taken to be 1)</w:t>
+              <w:t xml:space="preserve">#&gt; (Dispersion parameter for Negative Binomial(0.0913) family taken to be 1)</w:t>
             </w:r>
             <w:r>
               <w:br/>
@@ -39596,7 +39596,7 @@
               <w:rPr>
                 <w:rStyle w:val="CommentTok"/>
               </w:rPr>
-              <w:t xml:space="preserve">#&gt;     Null deviance: 61.511  on 108  degrees of freedom</w:t>
+              <w:t xml:space="preserve">#&gt;     Null deviance: 62.231  on 108  degrees of freedom</w:t>
             </w:r>
             <w:r>
               <w:br/>
@@ -39605,7 +39605,7 @@
               <w:rPr>
                 <w:rStyle w:val="CommentTok"/>
               </w:rPr>
-              <w:t xml:space="preserve">#&gt; Residual deviance: 52.284  on  98  degrees of freedom</w:t>
+              <w:t xml:space="preserve">#&gt; Residual deviance: 60.031  on  98  degrees of freedom</w:t>
             </w:r>
             <w:r>
               <w:br/>
@@ -39623,7 +39623,7 @@
               <w:rPr>
                 <w:rStyle w:val="CommentTok"/>
               </w:rPr>
-              <w:t xml:space="preserve">#&gt; AIC: 261.5</w:t>
+              <w:t xml:space="preserve">#&gt; AIC: 267.9</w:t>
             </w:r>
             <w:r>
               <w:br/>
@@ -39668,7 +39668,7 @@
               <w:rPr>
                 <w:rStyle w:val="CommentTok"/>
               </w:rPr>
-              <w:t xml:space="preserve">#&gt;               Theta:  0.0904 </w:t>
+              <w:t xml:space="preserve">#&gt;               Theta:  0.0832 </w:t>
             </w:r>
             <w:r>
               <w:br/>
@@ -39677,7 +39677,7 @@
               <w:rPr>
                 <w:rStyle w:val="CommentTok"/>
               </w:rPr>
-              <w:t xml:space="preserve">#&gt;           Std. Err.:  0.0239 </w:t>
+              <w:t xml:space="preserve">#&gt;           Std. Err.:  0.0216 </w:t>
             </w:r>
             <w:r>
               <w:br/>
@@ -39704,7 +39704,7 @@
               <w:rPr>
                 <w:rStyle w:val="CommentTok"/>
               </w:rPr>
-              <w:t xml:space="preserve">#&gt;  2 x log-likelihood:  -237.5430</w:t>
+              <w:t xml:space="preserve">#&gt;  2 x log-likelihood:  -243.8880</w:t>
             </w:r>
           </w:p>
           <w:bookmarkEnd w:id="88"/>
@@ -40171,11 +40171,11 @@
               <w:tblLook w:firstRow="1" w:lastRow="0" w:firstColumn="0" w:lastColumn="0" w:noHBand="0" w:noVBand="0" w:val="0020"/>
             </w:tblPr>
             <w:tblGrid>
-              <w:gridCol w:w="2970"/>
-              <w:gridCol w:w="1485"/>
-              <w:gridCol w:w="1287"/>
-              <w:gridCol w:w="1089"/>
-              <w:gridCol w:w="1089"/>
+              <w:gridCol w:w="3046"/>
+              <w:gridCol w:w="1523"/>
+              <w:gridCol w:w="1320"/>
+              <w:gridCol w:w="1015"/>
+              <w:gridCol w:w="1015"/>
             </w:tblGrid>
             <w:tr>
               <w:trPr>
@@ -40296,7 +40296,7 @@
                     <w:jc w:val="center"/>
                   </w:pPr>
                   <w:r>
-                    <w:t xml:space="preserve">2.895</w:t>
+                    <w:t xml:space="preserve">6.454</w:t>
                   </w:r>
                 </w:p>
               </w:tc>
@@ -40309,7 +40309,7 @@
                     <w:jc w:val="center"/>
                   </w:pPr>
                   <w:r>
-                    <w:t xml:space="preserve">1.929</w:t>
+                    <w:t xml:space="preserve">1.842</w:t>
                   </w:r>
                 </w:p>
               </w:tc>
@@ -40363,7 +40363,7 @@
                     <w:jc w:val="center"/>
                   </w:pPr>
                   <w:r>
-                    <w:t xml:space="preserve">2.553</w:t>
+                    <w:t xml:space="preserve">1.151</w:t>
                   </w:r>
                 </w:p>
               </w:tc>
@@ -40376,7 +40376,7 @@
                     <w:jc w:val="center"/>
                   </w:pPr>
                   <w:r>
-                    <w:t xml:space="preserve">0.8024</w:t>
+                    <w:t xml:space="preserve">0.7366</w:t>
                   </w:r>
                 </w:p>
               </w:tc>
@@ -40430,7 +40430,7 @@
                     <w:jc w:val="center"/>
                   </w:pPr>
                   <w:r>
-                    <w:t xml:space="preserve">-0.07291</w:t>
+                    <w:t xml:space="preserve">-0.1485</w:t>
                   </w:r>
                 </w:p>
               </w:tc>
@@ -40443,7 +40443,7 @@
                     <w:jc w:val="center"/>
                   </w:pPr>
                   <w:r>
-                    <w:t xml:space="preserve">0.04468</w:t>
+                    <w:t xml:space="preserve">0.04326</w:t>
                   </w:r>
                 </w:p>
               </w:tc>
@@ -40497,7 +40497,7 @@
                     <w:jc w:val="center"/>
                   </w:pPr>
                   <w:r>
-                    <w:t xml:space="preserve">-0.5545</w:t>
+                    <w:t xml:space="preserve">0.2198</w:t>
                   </w:r>
                 </w:p>
               </w:tc>
@@ -40510,7 +40510,7 @@
                     <w:jc w:val="center"/>
                   </w:pPr>
                   <w:r>
-                    <w:t xml:space="preserve">0.8869</w:t>
+                    <w:t xml:space="preserve">0.8179</w:t>
                   </w:r>
                 </w:p>
               </w:tc>
@@ -40564,7 +40564,7 @@
                     <w:jc w:val="center"/>
                   </w:pPr>
                   <w:r>
-                    <w:t xml:space="preserve">0.91</w:t>
+                    <w:t xml:space="preserve">1.596</w:t>
                   </w:r>
                 </w:p>
               </w:tc>
@@ -40577,7 +40577,7 @@
                     <w:jc w:val="center"/>
                   </w:pPr>
                   <w:r>
-                    <w:t xml:space="preserve">0.9416</w:t>
+                    <w:t xml:space="preserve">0.889</w:t>
                   </w:r>
                 </w:p>
               </w:tc>
@@ -40631,7 +40631,7 @@
                     <w:jc w:val="center"/>
                   </w:pPr>
                   <w:r>
-                    <w:t xml:space="preserve">2.622</w:t>
+                    <w:t xml:space="preserve">3.776</w:t>
                   </w:r>
                 </w:p>
               </w:tc>
@@ -40644,7 +40644,7 @@
                     <w:jc w:val="center"/>
                   </w:pPr>
                   <w:r>
-                    <w:t xml:space="preserve">1.584</w:t>
+                    <w:t xml:space="preserve">1.524</w:t>
                   </w:r>
                 </w:p>
               </w:tc>
@@ -40698,7 +40698,7 @@
                     <w:jc w:val="center"/>
                   </w:pPr>
                   <w:r>
-                    <w:t xml:space="preserve">-1.596</w:t>
+                    <w:t xml:space="preserve">-3.236</w:t>
                   </w:r>
                 </w:p>
               </w:tc>
@@ -40711,7 +40711,7 @@
                     <w:jc w:val="center"/>
                   </w:pPr>
                   <w:r>
-                    <w:t xml:space="preserve">2.175</w:t>
+                    <w:t xml:space="preserve">2.266</w:t>
                   </w:r>
                 </w:p>
               </w:tc>
@@ -40765,7 +40765,7 @@
                     <w:jc w:val="center"/>
                   </w:pPr>
                   <w:r>
-                    <w:t xml:space="preserve">-3.706</w:t>
+                    <w:t xml:space="preserve">-4.053</w:t>
                   </w:r>
                 </w:p>
               </w:tc>
@@ -40778,7 +40778,7 @@
                     <w:jc w:val="center"/>
                   </w:pPr>
                   <w:r>
-                    <w:t xml:space="preserve">1.333</w:t>
+                    <w:t xml:space="preserve">1.09</w:t>
                   </w:r>
                 </w:p>
               </w:tc>
@@ -40832,7 +40832,7 @@
                     <w:jc w:val="center"/>
                   </w:pPr>
                   <w:r>
-                    <w:t xml:space="preserve">-3.481</w:t>
+                    <w:t xml:space="preserve">-1.155</w:t>
                   </w:r>
                 </w:p>
               </w:tc>
@@ -40845,7 +40845,7 @@
                     <w:jc w:val="center"/>
                   </w:pPr>
                   <w:r>
-                    <w:t xml:space="preserve">1.504</w:t>
+                    <w:t xml:space="preserve">1.319</w:t>
                   </w:r>
                 </w:p>
               </w:tc>
@@ -40899,7 +40899,7 @@
                     <w:jc w:val="center"/>
                   </w:pPr>
                   <w:r>
-                    <w:t xml:space="preserve">-1.561</w:t>
+                    <w:t xml:space="preserve">-2.645</w:t>
                   </w:r>
                 </w:p>
               </w:tc>
@@ -40912,7 +40912,7 @@
                     <w:jc w:val="center"/>
                   </w:pPr>
                   <w:r>
-                    <w:t xml:space="preserve">1.248</w:t>
+                    <w:t xml:space="preserve">1.077</w:t>
                   </w:r>
                 </w:p>
               </w:tc>
@@ -40966,7 +40966,7 @@
                     <w:jc w:val="center"/>
                   </w:pPr>
                   <w:r>
-                    <w:t xml:space="preserve">-0.0449</w:t>
+                    <w:t xml:space="preserve">0.09484</w:t>
                   </w:r>
                 </w:p>
               </w:tc>
@@ -40979,7 +40979,7 @@
                     <w:jc w:val="center"/>
                   </w:pPr>
                   <w:r>
-                    <w:t xml:space="preserve">0.06845</w:t>
+                    <w:t xml:space="preserve">0.06476</w:t>
                   </w:r>
                 </w:p>
               </w:tc>

</xml_diff>

<commit_message>
Deploying to gh-pages from @ Morrison-Lab/rme@966a16c26b5878efad30351789b630fe684ec89f 🚀
</commit_message>
<xml_diff>
--- a/chapters/count-regression-handout.docx
+++ b/chapters/count-regression-handout.docx
@@ -39407,7 +39407,7 @@
               <w:rPr>
                 <w:rStyle w:val="CommentTok"/>
               </w:rPr>
-              <w:t xml:space="preserve">#&gt;     hivstat + sexabuse + hplsns, data = needles, init.theta = 0.08315440712, </w:t>
+              <w:t xml:space="preserve">#&gt;     hivstat + sexabuse + hplsns, data = needles, init.theta = 0.0903642555, </w:t>
             </w:r>
             <w:r>
               <w:br/>
@@ -39443,7 +39443,7 @@
               <w:rPr>
                 <w:rStyle w:val="CommentTok"/>
               </w:rPr>
-              <w:t xml:space="preserve">#&gt;                             Estimate Std. Error z value Pr(&gt;|z|)    </w:t>
+              <w:t xml:space="preserve">#&gt;                             Estimate Std. Error z value Pr(&gt;|z|)   </w:t>
             </w:r>
             <w:r>
               <w:br/>
@@ -39452,7 +39452,7 @@
               <w:rPr>
                 <w:rStyle w:val="CommentTok"/>
               </w:rPr>
-              <w:t xml:space="preserve">#&gt; (Intercept)                   6.4536     1.8421    3.50  0.00046 ***</w:t>
+              <w:t xml:space="preserve">#&gt; (Intercept)                   2.8948     1.9293    1.50   0.1335   </w:t>
             </w:r>
             <w:r>
               <w:br/>
@@ -39461,7 +39461,7 @@
               <w:rPr>
                 <w:rStyle w:val="CommentTok"/>
               </w:rPr>
-              <w:t xml:space="preserve">#&gt; homelesshomeless              1.1508     0.7366    1.56  0.11820    </w:t>
+              <w:t xml:space="preserve">#&gt; homelesshomeless              2.5534     0.8024    3.18   0.0015 **</w:t>
             </w:r>
             <w:r>
               <w:br/>
@@ -39470,7 +39470,7 @@
               <w:rPr>
                 <w:rStyle w:val="CommentTok"/>
               </w:rPr>
-              <w:t xml:space="preserve">#&gt; age                          -0.1485     0.0433   -3.43  0.00059 ***</w:t>
+              <w:t xml:space="preserve">#&gt; age                          -0.0729     0.0447   -1.63   0.1027   </w:t>
             </w:r>
             <w:r>
               <w:br/>
@@ -39479,7 +39479,7 @@
               <w:rPr>
                 <w:rStyle w:val="CommentTok"/>
               </w:rPr>
-              <w:t xml:space="preserve">#&gt; sexF                          0.2198     0.8179    0.27  0.78813    </w:t>
+              <w:t xml:space="preserve">#&gt; sexF                         -0.5545     0.8869   -0.63   0.5318   </w:t>
             </w:r>
             <w:r>
               <w:br/>
@@ -39488,7 +39488,7 @@
               <w:rPr>
                 <w:rStyle w:val="CommentTok"/>
               </w:rPr>
-              <w:t xml:space="preserve">#&gt; ethnAA                        1.5958     0.8890    1.79  0.07265 .  </w:t>
+              <w:t xml:space="preserve">#&gt; ethnAA                        0.9100     0.9416    0.97   0.3339   </w:t>
             </w:r>
             <w:r>
               <w:br/>
@@ -39497,7 +39497,7 @@
               <w:rPr>
                 <w:rStyle w:val="CommentTok"/>
               </w:rPr>
-              <w:t xml:space="preserve">#&gt; ethnHispanic                  3.7763     1.5240    2.48  0.01322 *  </w:t>
+              <w:t xml:space="preserve">#&gt; ethnHispanic                  2.6222     1.5835    1.66   0.0977 . </w:t>
             </w:r>
             <w:r>
               <w:br/>
@@ -39506,7 +39506,7 @@
               <w:rPr>
                 <w:rStyle w:val="CommentTok"/>
               </w:rPr>
-              <w:t xml:space="preserve">#&gt; ethnOther                    -3.2365     2.2663   -1.43  0.15327    </w:t>
+              <w:t xml:space="preserve">#&gt; ethnOther                    -1.5963     2.1745   -0.73   0.4629   </w:t>
             </w:r>
             <w:r>
               <w:br/>
@@ -39515,7 +39515,7 @@
               <w:rPr>
                 <w:rStyle w:val="CommentTok"/>
               </w:rPr>
-              <w:t xml:space="preserve">#&gt; polydrugmultiple drugs used  -4.0532     1.0898   -3.72  0.00020 ***</w:t>
+              <w:t xml:space="preserve">#&gt; polydrugmultiple drugs used  -3.7062     1.3330   -2.78   0.0054 **</w:t>
             </w:r>
             <w:r>
               <w:br/>
@@ -39524,7 +39524,7 @@
               <w:rPr>
                 <w:rStyle w:val="CommentTok"/>
               </w:rPr>
-              <w:t xml:space="preserve">#&gt; hivstatHIV+                  -1.1548     1.3185   -0.88  0.38113    </w:t>
+              <w:t xml:space="preserve">#&gt; hivstatHIV+                  -3.4809     1.5036   -2.32   0.0206 * </w:t>
             </w:r>
             <w:r>
               <w:br/>
@@ -39533,7 +39533,7 @@
               <w:rPr>
                 <w:rStyle w:val="CommentTok"/>
               </w:rPr>
-              <w:t xml:space="preserve">#&gt; sexabuseyes                  -2.6449     1.0772   -2.46  0.01408 *  </w:t>
+              <w:t xml:space="preserve">#&gt; sexabuseyes                  -1.5612     1.2484   -1.25   0.2111   </w:t>
             </w:r>
             <w:r>
               <w:br/>
@@ -39542,7 +39542,7 @@
               <w:rPr>
                 <w:rStyle w:val="CommentTok"/>
               </w:rPr>
-              <w:t xml:space="preserve">#&gt; hplsns                        0.0948     0.0648    1.46  0.14306    </w:t>
+              <w:t xml:space="preserve">#&gt; hplsns                       -0.0449     0.0685   -0.66   0.5119   </w:t>
             </w:r>
             <w:r>
               <w:br/>
@@ -39578,7 +39578,7 @@
               <w:rPr>
                 <w:rStyle w:val="CommentTok"/>
               </w:rPr>
-              <w:t xml:space="preserve">#&gt; (Dispersion parameter for Negative Binomial(0.0913) family taken to be 1)</w:t>
+              <w:t xml:space="preserve">#&gt; (Dispersion parameter for Negative Binomial(0.0899) family taken to be 1)</w:t>
             </w:r>
             <w:r>
               <w:br/>
@@ -39596,7 +39596,7 @@
               <w:rPr>
                 <w:rStyle w:val="CommentTok"/>
               </w:rPr>
-              <w:t xml:space="preserve">#&gt;     Null deviance: 62.231  on 108  degrees of freedom</w:t>
+              <w:t xml:space="preserve">#&gt;     Null deviance: 61.511  on 108  degrees of freedom</w:t>
             </w:r>
             <w:r>
               <w:br/>
@@ -39605,7 +39605,7 @@
               <w:rPr>
                 <w:rStyle w:val="CommentTok"/>
               </w:rPr>
-              <w:t xml:space="preserve">#&gt; Residual deviance: 60.031  on  98  degrees of freedom</w:t>
+              <w:t xml:space="preserve">#&gt; Residual deviance: 52.284  on  98  degrees of freedom</w:t>
             </w:r>
             <w:r>
               <w:br/>
@@ -39623,7 +39623,7 @@
               <w:rPr>
                 <w:rStyle w:val="CommentTok"/>
               </w:rPr>
-              <w:t xml:space="preserve">#&gt; AIC: 267.9</w:t>
+              <w:t xml:space="preserve">#&gt; AIC: 261.5</w:t>
             </w:r>
             <w:r>
               <w:br/>
@@ -39668,7 +39668,7 @@
               <w:rPr>
                 <w:rStyle w:val="CommentTok"/>
               </w:rPr>
-              <w:t xml:space="preserve">#&gt;               Theta:  0.0832 </w:t>
+              <w:t xml:space="preserve">#&gt;               Theta:  0.0904 </w:t>
             </w:r>
             <w:r>
               <w:br/>
@@ -39677,7 +39677,7 @@
               <w:rPr>
                 <w:rStyle w:val="CommentTok"/>
               </w:rPr>
-              <w:t xml:space="preserve">#&gt;           Std. Err.:  0.0216 </w:t>
+              <w:t xml:space="preserve">#&gt;           Std. Err.:  0.0239 </w:t>
             </w:r>
             <w:r>
               <w:br/>
@@ -39704,7 +39704,7 @@
               <w:rPr>
                 <w:rStyle w:val="CommentTok"/>
               </w:rPr>
-              <w:t xml:space="preserve">#&gt;  2 x log-likelihood:  -243.8880</w:t>
+              <w:t xml:space="preserve">#&gt;  2 x log-likelihood:  -237.5430</w:t>
             </w:r>
           </w:p>
           <w:bookmarkEnd w:id="88"/>
@@ -40171,11 +40171,11 @@
               <w:tblLook w:firstRow="1" w:lastRow="0" w:firstColumn="0" w:lastColumn="0" w:noHBand="0" w:noVBand="0" w:val="0020"/>
             </w:tblPr>
             <w:tblGrid>
-              <w:gridCol w:w="3046"/>
-              <w:gridCol w:w="1523"/>
-              <w:gridCol w:w="1320"/>
-              <w:gridCol w:w="1015"/>
-              <w:gridCol w:w="1015"/>
+              <w:gridCol w:w="2970"/>
+              <w:gridCol w:w="1485"/>
+              <w:gridCol w:w="1287"/>
+              <w:gridCol w:w="1089"/>
+              <w:gridCol w:w="1089"/>
             </w:tblGrid>
             <w:tr>
               <w:trPr>
@@ -40296,7 +40296,7 @@
                     <w:jc w:val="center"/>
                   </w:pPr>
                   <w:r>
-                    <w:t xml:space="preserve">6.454</w:t>
+                    <w:t xml:space="preserve">2.895</w:t>
                   </w:r>
                 </w:p>
               </w:tc>
@@ -40309,7 +40309,7 @@
                     <w:jc w:val="center"/>
                   </w:pPr>
                   <w:r>
-                    <w:t xml:space="preserve">1.842</w:t>
+                    <w:t xml:space="preserve">1.929</w:t>
                   </w:r>
                 </w:p>
               </w:tc>
@@ -40363,7 +40363,7 @@
                     <w:jc w:val="center"/>
                   </w:pPr>
                   <w:r>
-                    <w:t xml:space="preserve">1.151</w:t>
+                    <w:t xml:space="preserve">2.553</w:t>
                   </w:r>
                 </w:p>
               </w:tc>
@@ -40376,7 +40376,7 @@
                     <w:jc w:val="center"/>
                   </w:pPr>
                   <w:r>
-                    <w:t xml:space="preserve">0.7366</w:t>
+                    <w:t xml:space="preserve">0.8024</w:t>
                   </w:r>
                 </w:p>
               </w:tc>
@@ -40430,7 +40430,7 @@
                     <w:jc w:val="center"/>
                   </w:pPr>
                   <w:r>
-                    <w:t xml:space="preserve">-0.1485</w:t>
+                    <w:t xml:space="preserve">-0.07291</w:t>
                   </w:r>
                 </w:p>
               </w:tc>
@@ -40443,7 +40443,7 @@
                     <w:jc w:val="center"/>
                   </w:pPr>
                   <w:r>
-                    <w:t xml:space="preserve">0.04326</w:t>
+                    <w:t xml:space="preserve">0.04468</w:t>
                   </w:r>
                 </w:p>
               </w:tc>
@@ -40497,7 +40497,7 @@
                     <w:jc w:val="center"/>
                   </w:pPr>
                   <w:r>
-                    <w:t xml:space="preserve">0.2198</w:t>
+                    <w:t xml:space="preserve">-0.5545</w:t>
                   </w:r>
                 </w:p>
               </w:tc>
@@ -40510,7 +40510,7 @@
                     <w:jc w:val="center"/>
                   </w:pPr>
                   <w:r>
-                    <w:t xml:space="preserve">0.8179</w:t>
+                    <w:t xml:space="preserve">0.8869</w:t>
                   </w:r>
                 </w:p>
               </w:tc>
@@ -40564,7 +40564,7 @@
                     <w:jc w:val="center"/>
                   </w:pPr>
                   <w:r>
-                    <w:t xml:space="preserve">1.596</w:t>
+                    <w:t xml:space="preserve">0.91</w:t>
                   </w:r>
                 </w:p>
               </w:tc>
@@ -40577,7 +40577,7 @@
                     <w:jc w:val="center"/>
                   </w:pPr>
                   <w:r>
-                    <w:t xml:space="preserve">0.889</w:t>
+                    <w:t xml:space="preserve">0.9416</w:t>
                   </w:r>
                 </w:p>
               </w:tc>
@@ -40631,7 +40631,7 @@
                     <w:jc w:val="center"/>
                   </w:pPr>
                   <w:r>
-                    <w:t xml:space="preserve">3.776</w:t>
+                    <w:t xml:space="preserve">2.622</w:t>
                   </w:r>
                 </w:p>
               </w:tc>
@@ -40644,7 +40644,7 @@
                     <w:jc w:val="center"/>
                   </w:pPr>
                   <w:r>
-                    <w:t xml:space="preserve">1.524</w:t>
+                    <w:t xml:space="preserve">1.584</w:t>
                   </w:r>
                 </w:p>
               </w:tc>
@@ -40698,7 +40698,7 @@
                     <w:jc w:val="center"/>
                   </w:pPr>
                   <w:r>
-                    <w:t xml:space="preserve">-3.236</w:t>
+                    <w:t xml:space="preserve">-1.596</w:t>
                   </w:r>
                 </w:p>
               </w:tc>
@@ -40711,7 +40711,7 @@
                     <w:jc w:val="center"/>
                   </w:pPr>
                   <w:r>
-                    <w:t xml:space="preserve">2.266</w:t>
+                    <w:t xml:space="preserve">2.175</w:t>
                   </w:r>
                 </w:p>
               </w:tc>
@@ -40765,7 +40765,7 @@
                     <w:jc w:val="center"/>
                   </w:pPr>
                   <w:r>
-                    <w:t xml:space="preserve">-4.053</w:t>
+                    <w:t xml:space="preserve">-3.706</w:t>
                   </w:r>
                 </w:p>
               </w:tc>
@@ -40778,7 +40778,7 @@
                     <w:jc w:val="center"/>
                   </w:pPr>
                   <w:r>
-                    <w:t xml:space="preserve">1.09</w:t>
+                    <w:t xml:space="preserve">1.333</w:t>
                   </w:r>
                 </w:p>
               </w:tc>
@@ -40832,7 +40832,7 @@
                     <w:jc w:val="center"/>
                   </w:pPr>
                   <w:r>
-                    <w:t xml:space="preserve">-1.155</w:t>
+                    <w:t xml:space="preserve">-3.481</w:t>
                   </w:r>
                 </w:p>
               </w:tc>
@@ -40845,7 +40845,7 @@
                     <w:jc w:val="center"/>
                   </w:pPr>
                   <w:r>
-                    <w:t xml:space="preserve">1.319</w:t>
+                    <w:t xml:space="preserve">1.504</w:t>
                   </w:r>
                 </w:p>
               </w:tc>
@@ -40899,7 +40899,7 @@
                     <w:jc w:val="center"/>
                   </w:pPr>
                   <w:r>
-                    <w:t xml:space="preserve">-2.645</w:t>
+                    <w:t xml:space="preserve">-1.561</w:t>
                   </w:r>
                 </w:p>
               </w:tc>
@@ -40912,7 +40912,7 @@
                     <w:jc w:val="center"/>
                   </w:pPr>
                   <w:r>
-                    <w:t xml:space="preserve">1.077</w:t>
+                    <w:t xml:space="preserve">1.248</w:t>
                   </w:r>
                 </w:p>
               </w:tc>
@@ -40966,7 +40966,7 @@
                     <w:jc w:val="center"/>
                   </w:pPr>
                   <w:r>
-                    <w:t xml:space="preserve">0.09484</w:t>
+                    <w:t xml:space="preserve">-0.0449</w:t>
                   </w:r>
                 </w:p>
               </w:tc>
@@ -40979,7 +40979,7 @@
                     <w:jc w:val="center"/>
                   </w:pPr>
                   <w:r>
-                    <w:t xml:space="preserve">0.06476</w:t>
+                    <w:t xml:space="preserve">0.06845</w:t>
                   </w:r>
                 </w:p>
               </w:tc>

</xml_diff>

<commit_message>
Deploying to gh-pages from @ Morrison-Lab/rme@09c16b530354e26a4729a1293885addba8fbf96a 🚀
</commit_message>
<xml_diff>
--- a/chapters/count-regression-handout.docx
+++ b/chapters/count-regression-handout.docx
@@ -39407,7 +39407,7 @@
               <w:rPr>
                 <w:rStyle w:val="CommentTok"/>
               </w:rPr>
-              <w:t xml:space="preserve">#&gt;     hivstat + sexabuse + hplsns, data = needles, init.theta = 0.0903642555, </w:t>
+              <w:t xml:space="preserve">#&gt;     hivstat + sexabuse + hplsns, data = needles, init.theta = 0.08315440712, </w:t>
             </w:r>
             <w:r>
               <w:br/>
@@ -39443,7 +39443,7 @@
               <w:rPr>
                 <w:rStyle w:val="CommentTok"/>
               </w:rPr>
-              <w:t xml:space="preserve">#&gt;                             Estimate Std. Error z value Pr(&gt;|z|)   </w:t>
+              <w:t xml:space="preserve">#&gt;                             Estimate Std. Error z value Pr(&gt;|z|)    </w:t>
             </w:r>
             <w:r>
               <w:br/>
@@ -39452,7 +39452,7 @@
               <w:rPr>
                 <w:rStyle w:val="CommentTok"/>
               </w:rPr>
-              <w:t xml:space="preserve">#&gt; (Intercept)                   2.8948     1.9293    1.50   0.1335   </w:t>
+              <w:t xml:space="preserve">#&gt; (Intercept)                   6.4536     1.8421    3.50  0.00046 ***</w:t>
             </w:r>
             <w:r>
               <w:br/>
@@ -39461,7 +39461,7 @@
               <w:rPr>
                 <w:rStyle w:val="CommentTok"/>
               </w:rPr>
-              <w:t xml:space="preserve">#&gt; homelesshomeless              2.5534     0.8024    3.18   0.0015 **</w:t>
+              <w:t xml:space="preserve">#&gt; homelesshomeless              1.1508     0.7366    1.56  0.11820    </w:t>
             </w:r>
             <w:r>
               <w:br/>
@@ -39470,7 +39470,7 @@
               <w:rPr>
                 <w:rStyle w:val="CommentTok"/>
               </w:rPr>
-              <w:t xml:space="preserve">#&gt; age                          -0.0729     0.0447   -1.63   0.1027   </w:t>
+              <w:t xml:space="preserve">#&gt; age                          -0.1485     0.0433   -3.43  0.00059 ***</w:t>
             </w:r>
             <w:r>
               <w:br/>
@@ -39479,7 +39479,7 @@
               <w:rPr>
                 <w:rStyle w:val="CommentTok"/>
               </w:rPr>
-              <w:t xml:space="preserve">#&gt; sexF                         -0.5545     0.8869   -0.63   0.5318   </w:t>
+              <w:t xml:space="preserve">#&gt; sexF                          0.2198     0.8179    0.27  0.78813    </w:t>
             </w:r>
             <w:r>
               <w:br/>
@@ -39488,7 +39488,7 @@
               <w:rPr>
                 <w:rStyle w:val="CommentTok"/>
               </w:rPr>
-              <w:t xml:space="preserve">#&gt; ethnAA                        0.9100     0.9416    0.97   0.3339   </w:t>
+              <w:t xml:space="preserve">#&gt; ethnAA                        1.5958     0.8890    1.79  0.07265 .  </w:t>
             </w:r>
             <w:r>
               <w:br/>
@@ -39497,7 +39497,7 @@
               <w:rPr>
                 <w:rStyle w:val="CommentTok"/>
               </w:rPr>
-              <w:t xml:space="preserve">#&gt; ethnHispanic                  2.6222     1.5835    1.66   0.0977 . </w:t>
+              <w:t xml:space="preserve">#&gt; ethnHispanic                  3.7763     1.5240    2.48  0.01322 *  </w:t>
             </w:r>
             <w:r>
               <w:br/>
@@ -39506,7 +39506,7 @@
               <w:rPr>
                 <w:rStyle w:val="CommentTok"/>
               </w:rPr>
-              <w:t xml:space="preserve">#&gt; ethnOther                    -1.5963     2.1745   -0.73   0.4629   </w:t>
+              <w:t xml:space="preserve">#&gt; ethnOther                    -3.2365     2.2663   -1.43  0.15327    </w:t>
             </w:r>
             <w:r>
               <w:br/>
@@ -39515,7 +39515,7 @@
               <w:rPr>
                 <w:rStyle w:val="CommentTok"/>
               </w:rPr>
-              <w:t xml:space="preserve">#&gt; polydrugmultiple drugs used  -3.7062     1.3330   -2.78   0.0054 **</w:t>
+              <w:t xml:space="preserve">#&gt; polydrugmultiple drugs used  -4.0532     1.0898   -3.72  0.00020 ***</w:t>
             </w:r>
             <w:r>
               <w:br/>
@@ -39524,7 +39524,7 @@
               <w:rPr>
                 <w:rStyle w:val="CommentTok"/>
               </w:rPr>
-              <w:t xml:space="preserve">#&gt; hivstatHIV+                  -3.4809     1.5036   -2.32   0.0206 * </w:t>
+              <w:t xml:space="preserve">#&gt; hivstatHIV+                  -1.1548     1.3185   -0.88  0.38113    </w:t>
             </w:r>
             <w:r>
               <w:br/>
@@ -39533,7 +39533,7 @@
               <w:rPr>
                 <w:rStyle w:val="CommentTok"/>
               </w:rPr>
-              <w:t xml:space="preserve">#&gt; sexabuseyes                  -1.5612     1.2484   -1.25   0.2111   </w:t>
+              <w:t xml:space="preserve">#&gt; sexabuseyes                  -2.6449     1.0772   -2.46  0.01408 *  </w:t>
             </w:r>
             <w:r>
               <w:br/>
@@ -39542,7 +39542,7 @@
               <w:rPr>
                 <w:rStyle w:val="CommentTok"/>
               </w:rPr>
-              <w:t xml:space="preserve">#&gt; hplsns                       -0.0449     0.0685   -0.66   0.5119   </w:t>
+              <w:t xml:space="preserve">#&gt; hplsns                        0.0948     0.0648    1.46  0.14306    </w:t>
             </w:r>
             <w:r>
               <w:br/>
@@ -39578,7 +39578,7 @@
               <w:rPr>
                 <w:rStyle w:val="CommentTok"/>
               </w:rPr>
-              <w:t xml:space="preserve">#&gt; (Dispersion parameter for Negative Binomial(0.0899) family taken to be 1)</w:t>
+              <w:t xml:space="preserve">#&gt; (Dispersion parameter for Negative Binomial(0.0913) family taken to be 1)</w:t>
             </w:r>
             <w:r>
               <w:br/>
@@ -39596,7 +39596,7 @@
               <w:rPr>
                 <w:rStyle w:val="CommentTok"/>
               </w:rPr>
-              <w:t xml:space="preserve">#&gt;     Null deviance: 61.511  on 108  degrees of freedom</w:t>
+              <w:t xml:space="preserve">#&gt;     Null deviance: 62.231  on 108  degrees of freedom</w:t>
             </w:r>
             <w:r>
               <w:br/>
@@ -39605,7 +39605,7 @@
               <w:rPr>
                 <w:rStyle w:val="CommentTok"/>
               </w:rPr>
-              <w:t xml:space="preserve">#&gt; Residual deviance: 52.284  on  98  degrees of freedom</w:t>
+              <w:t xml:space="preserve">#&gt; Residual deviance: 60.031  on  98  degrees of freedom</w:t>
             </w:r>
             <w:r>
               <w:br/>
@@ -39623,7 +39623,7 @@
               <w:rPr>
                 <w:rStyle w:val="CommentTok"/>
               </w:rPr>
-              <w:t xml:space="preserve">#&gt; AIC: 261.5</w:t>
+              <w:t xml:space="preserve">#&gt; AIC: 267.9</w:t>
             </w:r>
             <w:r>
               <w:br/>
@@ -39668,7 +39668,7 @@
               <w:rPr>
                 <w:rStyle w:val="CommentTok"/>
               </w:rPr>
-              <w:t xml:space="preserve">#&gt;               Theta:  0.0904 </w:t>
+              <w:t xml:space="preserve">#&gt;               Theta:  0.0832 </w:t>
             </w:r>
             <w:r>
               <w:br/>
@@ -39677,7 +39677,7 @@
               <w:rPr>
                 <w:rStyle w:val="CommentTok"/>
               </w:rPr>
-              <w:t xml:space="preserve">#&gt;           Std. Err.:  0.0239 </w:t>
+              <w:t xml:space="preserve">#&gt;           Std. Err.:  0.0216 </w:t>
             </w:r>
             <w:r>
               <w:br/>
@@ -39704,7 +39704,7 @@
               <w:rPr>
                 <w:rStyle w:val="CommentTok"/>
               </w:rPr>
-              <w:t xml:space="preserve">#&gt;  2 x log-likelihood:  -237.5430</w:t>
+              <w:t xml:space="preserve">#&gt;  2 x log-likelihood:  -243.8880</w:t>
             </w:r>
           </w:p>
           <w:bookmarkEnd w:id="88"/>
@@ -40171,11 +40171,11 @@
               <w:tblLook w:firstRow="1" w:lastRow="0" w:firstColumn="0" w:lastColumn="0" w:noHBand="0" w:noVBand="0" w:val="0020"/>
             </w:tblPr>
             <w:tblGrid>
-              <w:gridCol w:w="2970"/>
-              <w:gridCol w:w="1485"/>
-              <w:gridCol w:w="1287"/>
-              <w:gridCol w:w="1089"/>
-              <w:gridCol w:w="1089"/>
+              <w:gridCol w:w="3046"/>
+              <w:gridCol w:w="1523"/>
+              <w:gridCol w:w="1320"/>
+              <w:gridCol w:w="1015"/>
+              <w:gridCol w:w="1015"/>
             </w:tblGrid>
             <w:tr>
               <w:trPr>
@@ -40296,7 +40296,7 @@
                     <w:jc w:val="center"/>
                   </w:pPr>
                   <w:r>
-                    <w:t xml:space="preserve">2.895</w:t>
+                    <w:t xml:space="preserve">6.454</w:t>
                   </w:r>
                 </w:p>
               </w:tc>
@@ -40309,7 +40309,7 @@
                     <w:jc w:val="center"/>
                   </w:pPr>
                   <w:r>
-                    <w:t xml:space="preserve">1.929</w:t>
+                    <w:t xml:space="preserve">1.842</w:t>
                   </w:r>
                 </w:p>
               </w:tc>
@@ -40363,7 +40363,7 @@
                     <w:jc w:val="center"/>
                   </w:pPr>
                   <w:r>
-                    <w:t xml:space="preserve">2.553</w:t>
+                    <w:t xml:space="preserve">1.151</w:t>
                   </w:r>
                 </w:p>
               </w:tc>
@@ -40376,7 +40376,7 @@
                     <w:jc w:val="center"/>
                   </w:pPr>
                   <w:r>
-                    <w:t xml:space="preserve">0.8024</w:t>
+                    <w:t xml:space="preserve">0.7366</w:t>
                   </w:r>
                 </w:p>
               </w:tc>
@@ -40430,7 +40430,7 @@
                     <w:jc w:val="center"/>
                   </w:pPr>
                   <w:r>
-                    <w:t xml:space="preserve">-0.07291</w:t>
+                    <w:t xml:space="preserve">-0.1485</w:t>
                   </w:r>
                 </w:p>
               </w:tc>
@@ -40443,7 +40443,7 @@
                     <w:jc w:val="center"/>
                   </w:pPr>
                   <w:r>
-                    <w:t xml:space="preserve">0.04468</w:t>
+                    <w:t xml:space="preserve">0.04326</w:t>
                   </w:r>
                 </w:p>
               </w:tc>
@@ -40497,7 +40497,7 @@
                     <w:jc w:val="center"/>
                   </w:pPr>
                   <w:r>
-                    <w:t xml:space="preserve">-0.5545</w:t>
+                    <w:t xml:space="preserve">0.2198</w:t>
                   </w:r>
                 </w:p>
               </w:tc>
@@ -40510,7 +40510,7 @@
                     <w:jc w:val="center"/>
                   </w:pPr>
                   <w:r>
-                    <w:t xml:space="preserve">0.8869</w:t>
+                    <w:t xml:space="preserve">0.8179</w:t>
                   </w:r>
                 </w:p>
               </w:tc>
@@ -40564,7 +40564,7 @@
                     <w:jc w:val="center"/>
                   </w:pPr>
                   <w:r>
-                    <w:t xml:space="preserve">0.91</w:t>
+                    <w:t xml:space="preserve">1.596</w:t>
                   </w:r>
                 </w:p>
               </w:tc>
@@ -40577,7 +40577,7 @@
                     <w:jc w:val="center"/>
                   </w:pPr>
                   <w:r>
-                    <w:t xml:space="preserve">0.9416</w:t>
+                    <w:t xml:space="preserve">0.889</w:t>
                   </w:r>
                 </w:p>
               </w:tc>
@@ -40631,7 +40631,7 @@
                     <w:jc w:val="center"/>
                   </w:pPr>
                   <w:r>
-                    <w:t xml:space="preserve">2.622</w:t>
+                    <w:t xml:space="preserve">3.776</w:t>
                   </w:r>
                 </w:p>
               </w:tc>
@@ -40644,7 +40644,7 @@
                     <w:jc w:val="center"/>
                   </w:pPr>
                   <w:r>
-                    <w:t xml:space="preserve">1.584</w:t>
+                    <w:t xml:space="preserve">1.524</w:t>
                   </w:r>
                 </w:p>
               </w:tc>
@@ -40698,7 +40698,7 @@
                     <w:jc w:val="center"/>
                   </w:pPr>
                   <w:r>
-                    <w:t xml:space="preserve">-1.596</w:t>
+                    <w:t xml:space="preserve">-3.236</w:t>
                   </w:r>
                 </w:p>
               </w:tc>
@@ -40711,7 +40711,7 @@
                     <w:jc w:val="center"/>
                   </w:pPr>
                   <w:r>
-                    <w:t xml:space="preserve">2.175</w:t>
+                    <w:t xml:space="preserve">2.266</w:t>
                   </w:r>
                 </w:p>
               </w:tc>
@@ -40765,7 +40765,7 @@
                     <w:jc w:val="center"/>
                   </w:pPr>
                   <w:r>
-                    <w:t xml:space="preserve">-3.706</w:t>
+                    <w:t xml:space="preserve">-4.053</w:t>
                   </w:r>
                 </w:p>
               </w:tc>
@@ -40778,7 +40778,7 @@
                     <w:jc w:val="center"/>
                   </w:pPr>
                   <w:r>
-                    <w:t xml:space="preserve">1.333</w:t>
+                    <w:t xml:space="preserve">1.09</w:t>
                   </w:r>
                 </w:p>
               </w:tc>
@@ -40832,7 +40832,7 @@
                     <w:jc w:val="center"/>
                   </w:pPr>
                   <w:r>
-                    <w:t xml:space="preserve">-3.481</w:t>
+                    <w:t xml:space="preserve">-1.155</w:t>
                   </w:r>
                 </w:p>
               </w:tc>
@@ -40845,7 +40845,7 @@
                     <w:jc w:val="center"/>
                   </w:pPr>
                   <w:r>
-                    <w:t xml:space="preserve">1.504</w:t>
+                    <w:t xml:space="preserve">1.319</w:t>
                   </w:r>
                 </w:p>
               </w:tc>
@@ -40899,7 +40899,7 @@
                     <w:jc w:val="center"/>
                   </w:pPr>
                   <w:r>
-                    <w:t xml:space="preserve">-1.561</w:t>
+                    <w:t xml:space="preserve">-2.645</w:t>
                   </w:r>
                 </w:p>
               </w:tc>
@@ -40912,7 +40912,7 @@
                     <w:jc w:val="center"/>
                   </w:pPr>
                   <w:r>
-                    <w:t xml:space="preserve">1.248</w:t>
+                    <w:t xml:space="preserve">1.077</w:t>
                   </w:r>
                 </w:p>
               </w:tc>
@@ -40966,7 +40966,7 @@
                     <w:jc w:val="center"/>
                   </w:pPr>
                   <w:r>
-                    <w:t xml:space="preserve">-0.0449</w:t>
+                    <w:t xml:space="preserve">0.09484</w:t>
                   </w:r>
                 </w:p>
               </w:tc>
@@ -40979,7 +40979,7 @@
                     <w:jc w:val="center"/>
                   </w:pPr>
                   <w:r>
-                    <w:t xml:space="preserve">0.06845</w:t>
+                    <w:t xml:space="preserve">0.06476</w:t>
                   </w:r>
                 </w:p>
               </w:tc>

</xml_diff>

<commit_message>
Deploying to gh-pages from @ Morrison-Lab/rme@d65553ed1c2b87584ecb532dbc7579c11e5f124c 🚀
</commit_message>
<xml_diff>
--- a/chapters/count-regression-handout.docx
+++ b/chapters/count-regression-handout.docx
@@ -39407,7 +39407,7 @@
               <w:rPr>
                 <w:rStyle w:val="CommentTok"/>
               </w:rPr>
-              <w:t xml:space="preserve">#&gt;     hivstat + sexabuse + hplsns, data = needles, init.theta = 0.08315440712, </w:t>
+              <w:t xml:space="preserve">#&gt;     hivstat + sexabuse + hplsns, data = needles, init.theta = 0.0903642555, </w:t>
             </w:r>
             <w:r>
               <w:br/>
@@ -39443,7 +39443,7 @@
               <w:rPr>
                 <w:rStyle w:val="CommentTok"/>
               </w:rPr>
-              <w:t xml:space="preserve">#&gt;                             Estimate Std. Error z value Pr(&gt;|z|)    </w:t>
+              <w:t xml:space="preserve">#&gt;                             Estimate Std. Error z value Pr(&gt;|z|)   </w:t>
             </w:r>
             <w:r>
               <w:br/>
@@ -39452,7 +39452,7 @@
               <w:rPr>
                 <w:rStyle w:val="CommentTok"/>
               </w:rPr>
-              <w:t xml:space="preserve">#&gt; (Intercept)                   6.4536     1.8421    3.50  0.00046 ***</w:t>
+              <w:t xml:space="preserve">#&gt; (Intercept)                   2.8948     1.9293    1.50   0.1335   </w:t>
             </w:r>
             <w:r>
               <w:br/>
@@ -39461,7 +39461,7 @@
               <w:rPr>
                 <w:rStyle w:val="CommentTok"/>
               </w:rPr>
-              <w:t xml:space="preserve">#&gt; homelesshomeless              1.1508     0.7366    1.56  0.11820    </w:t>
+              <w:t xml:space="preserve">#&gt; homelesshomeless              2.5534     0.8024    3.18   0.0015 **</w:t>
             </w:r>
             <w:r>
               <w:br/>
@@ -39470,7 +39470,7 @@
               <w:rPr>
                 <w:rStyle w:val="CommentTok"/>
               </w:rPr>
-              <w:t xml:space="preserve">#&gt; age                          -0.1485     0.0433   -3.43  0.00059 ***</w:t>
+              <w:t xml:space="preserve">#&gt; age                          -0.0729     0.0447   -1.63   0.1027   </w:t>
             </w:r>
             <w:r>
               <w:br/>
@@ -39479,7 +39479,7 @@
               <w:rPr>
                 <w:rStyle w:val="CommentTok"/>
               </w:rPr>
-              <w:t xml:space="preserve">#&gt; sexF                          0.2198     0.8179    0.27  0.78813    </w:t>
+              <w:t xml:space="preserve">#&gt; sexF                         -0.5545     0.8869   -0.63   0.5318   </w:t>
             </w:r>
             <w:r>
               <w:br/>
@@ -39488,7 +39488,7 @@
               <w:rPr>
                 <w:rStyle w:val="CommentTok"/>
               </w:rPr>
-              <w:t xml:space="preserve">#&gt; ethnAA                        1.5958     0.8890    1.79  0.07265 .  </w:t>
+              <w:t xml:space="preserve">#&gt; ethnAA                        0.9100     0.9416    0.97   0.3339   </w:t>
             </w:r>
             <w:r>
               <w:br/>
@@ -39497,7 +39497,7 @@
               <w:rPr>
                 <w:rStyle w:val="CommentTok"/>
               </w:rPr>
-              <w:t xml:space="preserve">#&gt; ethnHispanic                  3.7763     1.5240    2.48  0.01322 *  </w:t>
+              <w:t xml:space="preserve">#&gt; ethnHispanic                  2.6222     1.5835    1.66   0.0977 . </w:t>
             </w:r>
             <w:r>
               <w:br/>
@@ -39506,7 +39506,7 @@
               <w:rPr>
                 <w:rStyle w:val="CommentTok"/>
               </w:rPr>
-              <w:t xml:space="preserve">#&gt; ethnOther                    -3.2365     2.2663   -1.43  0.15327    </w:t>
+              <w:t xml:space="preserve">#&gt; ethnOther                    -1.5963     2.1745   -0.73   0.4629   </w:t>
             </w:r>
             <w:r>
               <w:br/>
@@ -39515,7 +39515,7 @@
               <w:rPr>
                 <w:rStyle w:val="CommentTok"/>
               </w:rPr>
-              <w:t xml:space="preserve">#&gt; polydrugmultiple drugs used  -4.0532     1.0898   -3.72  0.00020 ***</w:t>
+              <w:t xml:space="preserve">#&gt; polydrugmultiple drugs used  -3.7062     1.3330   -2.78   0.0054 **</w:t>
             </w:r>
             <w:r>
               <w:br/>
@@ -39524,7 +39524,7 @@
               <w:rPr>
                 <w:rStyle w:val="CommentTok"/>
               </w:rPr>
-              <w:t xml:space="preserve">#&gt; hivstatHIV+                  -1.1548     1.3185   -0.88  0.38113    </w:t>
+              <w:t xml:space="preserve">#&gt; hivstatHIV+                  -3.4809     1.5036   -2.32   0.0206 * </w:t>
             </w:r>
             <w:r>
               <w:br/>
@@ -39533,7 +39533,7 @@
               <w:rPr>
                 <w:rStyle w:val="CommentTok"/>
               </w:rPr>
-              <w:t xml:space="preserve">#&gt; sexabuseyes                  -2.6449     1.0772   -2.46  0.01408 *  </w:t>
+              <w:t xml:space="preserve">#&gt; sexabuseyes                  -1.5612     1.2484   -1.25   0.2111   </w:t>
             </w:r>
             <w:r>
               <w:br/>
@@ -39542,7 +39542,7 @@
               <w:rPr>
                 <w:rStyle w:val="CommentTok"/>
               </w:rPr>
-              <w:t xml:space="preserve">#&gt; hplsns                        0.0948     0.0648    1.46  0.14306    </w:t>
+              <w:t xml:space="preserve">#&gt; hplsns                       -0.0449     0.0685   -0.66   0.5119   </w:t>
             </w:r>
             <w:r>
               <w:br/>
@@ -39578,7 +39578,7 @@
               <w:rPr>
                 <w:rStyle w:val="CommentTok"/>
               </w:rPr>
-              <w:t xml:space="preserve">#&gt; (Dispersion parameter for Negative Binomial(0.0913) family taken to be 1)</w:t>
+              <w:t xml:space="preserve">#&gt; (Dispersion parameter for Negative Binomial(0.0899) family taken to be 1)</w:t>
             </w:r>
             <w:r>
               <w:br/>
@@ -39596,7 +39596,7 @@
               <w:rPr>
                 <w:rStyle w:val="CommentTok"/>
               </w:rPr>
-              <w:t xml:space="preserve">#&gt;     Null deviance: 62.231  on 108  degrees of freedom</w:t>
+              <w:t xml:space="preserve">#&gt;     Null deviance: 61.511  on 108  degrees of freedom</w:t>
             </w:r>
             <w:r>
               <w:br/>
@@ -39605,7 +39605,7 @@
               <w:rPr>
                 <w:rStyle w:val="CommentTok"/>
               </w:rPr>
-              <w:t xml:space="preserve">#&gt; Residual deviance: 60.031  on  98  degrees of freedom</w:t>
+              <w:t xml:space="preserve">#&gt; Residual deviance: 52.284  on  98  degrees of freedom</w:t>
             </w:r>
             <w:r>
               <w:br/>
@@ -39623,7 +39623,7 @@
               <w:rPr>
                 <w:rStyle w:val="CommentTok"/>
               </w:rPr>
-              <w:t xml:space="preserve">#&gt; AIC: 267.9</w:t>
+              <w:t xml:space="preserve">#&gt; AIC: 261.5</w:t>
             </w:r>
             <w:r>
               <w:br/>
@@ -39668,7 +39668,7 @@
               <w:rPr>
                 <w:rStyle w:val="CommentTok"/>
               </w:rPr>
-              <w:t xml:space="preserve">#&gt;               Theta:  0.0832 </w:t>
+              <w:t xml:space="preserve">#&gt;               Theta:  0.0904 </w:t>
             </w:r>
             <w:r>
               <w:br/>
@@ -39677,7 +39677,7 @@
               <w:rPr>
                 <w:rStyle w:val="CommentTok"/>
               </w:rPr>
-              <w:t xml:space="preserve">#&gt;           Std. Err.:  0.0216 </w:t>
+              <w:t xml:space="preserve">#&gt;           Std. Err.:  0.0239 </w:t>
             </w:r>
             <w:r>
               <w:br/>
@@ -39704,7 +39704,7 @@
               <w:rPr>
                 <w:rStyle w:val="CommentTok"/>
               </w:rPr>
-              <w:t xml:space="preserve">#&gt;  2 x log-likelihood:  -243.8880</w:t>
+              <w:t xml:space="preserve">#&gt;  2 x log-likelihood:  -237.5430</w:t>
             </w:r>
           </w:p>
           <w:bookmarkEnd w:id="88"/>
@@ -40171,11 +40171,11 @@
               <w:tblLook w:firstRow="1" w:lastRow="0" w:firstColumn="0" w:lastColumn="0" w:noHBand="0" w:noVBand="0" w:val="0020"/>
             </w:tblPr>
             <w:tblGrid>
-              <w:gridCol w:w="3046"/>
-              <w:gridCol w:w="1523"/>
-              <w:gridCol w:w="1320"/>
-              <w:gridCol w:w="1015"/>
-              <w:gridCol w:w="1015"/>
+              <w:gridCol w:w="2970"/>
+              <w:gridCol w:w="1485"/>
+              <w:gridCol w:w="1287"/>
+              <w:gridCol w:w="1089"/>
+              <w:gridCol w:w="1089"/>
             </w:tblGrid>
             <w:tr>
               <w:trPr>
@@ -40296,7 +40296,7 @@
                     <w:jc w:val="center"/>
                   </w:pPr>
                   <w:r>
-                    <w:t xml:space="preserve">6.454</w:t>
+                    <w:t xml:space="preserve">2.895</w:t>
                   </w:r>
                 </w:p>
               </w:tc>
@@ -40309,7 +40309,7 @@
                     <w:jc w:val="center"/>
                   </w:pPr>
                   <w:r>
-                    <w:t xml:space="preserve">1.842</w:t>
+                    <w:t xml:space="preserve">1.929</w:t>
                   </w:r>
                 </w:p>
               </w:tc>
@@ -40363,7 +40363,7 @@
                     <w:jc w:val="center"/>
                   </w:pPr>
                   <w:r>
-                    <w:t xml:space="preserve">1.151</w:t>
+                    <w:t xml:space="preserve">2.553</w:t>
                   </w:r>
                 </w:p>
               </w:tc>
@@ -40376,7 +40376,7 @@
                     <w:jc w:val="center"/>
                   </w:pPr>
                   <w:r>
-                    <w:t xml:space="preserve">0.7366</w:t>
+                    <w:t xml:space="preserve">0.8024</w:t>
                   </w:r>
                 </w:p>
               </w:tc>
@@ -40430,7 +40430,7 @@
                     <w:jc w:val="center"/>
                   </w:pPr>
                   <w:r>
-                    <w:t xml:space="preserve">-0.1485</w:t>
+                    <w:t xml:space="preserve">-0.07291</w:t>
                   </w:r>
                 </w:p>
               </w:tc>
@@ -40443,7 +40443,7 @@
                     <w:jc w:val="center"/>
                   </w:pPr>
                   <w:r>
-                    <w:t xml:space="preserve">0.04326</w:t>
+                    <w:t xml:space="preserve">0.04468</w:t>
                   </w:r>
                 </w:p>
               </w:tc>
@@ -40497,7 +40497,7 @@
                     <w:jc w:val="center"/>
                   </w:pPr>
                   <w:r>
-                    <w:t xml:space="preserve">0.2198</w:t>
+                    <w:t xml:space="preserve">-0.5545</w:t>
                   </w:r>
                 </w:p>
               </w:tc>
@@ -40510,7 +40510,7 @@
                     <w:jc w:val="center"/>
                   </w:pPr>
                   <w:r>
-                    <w:t xml:space="preserve">0.8179</w:t>
+                    <w:t xml:space="preserve">0.8869</w:t>
                   </w:r>
                 </w:p>
               </w:tc>
@@ -40564,7 +40564,7 @@
                     <w:jc w:val="center"/>
                   </w:pPr>
                   <w:r>
-                    <w:t xml:space="preserve">1.596</w:t>
+                    <w:t xml:space="preserve">0.91</w:t>
                   </w:r>
                 </w:p>
               </w:tc>
@@ -40577,7 +40577,7 @@
                     <w:jc w:val="center"/>
                   </w:pPr>
                   <w:r>
-                    <w:t xml:space="preserve">0.889</w:t>
+                    <w:t xml:space="preserve">0.9416</w:t>
                   </w:r>
                 </w:p>
               </w:tc>
@@ -40631,7 +40631,7 @@
                     <w:jc w:val="center"/>
                   </w:pPr>
                   <w:r>
-                    <w:t xml:space="preserve">3.776</w:t>
+                    <w:t xml:space="preserve">2.622</w:t>
                   </w:r>
                 </w:p>
               </w:tc>
@@ -40644,7 +40644,7 @@
                     <w:jc w:val="center"/>
                   </w:pPr>
                   <w:r>
-                    <w:t xml:space="preserve">1.524</w:t>
+                    <w:t xml:space="preserve">1.584</w:t>
                   </w:r>
                 </w:p>
               </w:tc>
@@ -40698,7 +40698,7 @@
                     <w:jc w:val="center"/>
                   </w:pPr>
                   <w:r>
-                    <w:t xml:space="preserve">-3.236</w:t>
+                    <w:t xml:space="preserve">-1.596</w:t>
                   </w:r>
                 </w:p>
               </w:tc>
@@ -40711,7 +40711,7 @@
                     <w:jc w:val="center"/>
                   </w:pPr>
                   <w:r>
-                    <w:t xml:space="preserve">2.266</w:t>
+                    <w:t xml:space="preserve">2.175</w:t>
                   </w:r>
                 </w:p>
               </w:tc>
@@ -40765,7 +40765,7 @@
                     <w:jc w:val="center"/>
                   </w:pPr>
                   <w:r>
-                    <w:t xml:space="preserve">-4.053</w:t>
+                    <w:t xml:space="preserve">-3.706</w:t>
                   </w:r>
                 </w:p>
               </w:tc>
@@ -40778,7 +40778,7 @@
                     <w:jc w:val="center"/>
                   </w:pPr>
                   <w:r>
-                    <w:t xml:space="preserve">1.09</w:t>
+                    <w:t xml:space="preserve">1.333</w:t>
                   </w:r>
                 </w:p>
               </w:tc>
@@ -40832,7 +40832,7 @@
                     <w:jc w:val="center"/>
                   </w:pPr>
                   <w:r>
-                    <w:t xml:space="preserve">-1.155</w:t>
+                    <w:t xml:space="preserve">-3.481</w:t>
                   </w:r>
                 </w:p>
               </w:tc>
@@ -40845,7 +40845,7 @@
                     <w:jc w:val="center"/>
                   </w:pPr>
                   <w:r>
-                    <w:t xml:space="preserve">1.319</w:t>
+                    <w:t xml:space="preserve">1.504</w:t>
                   </w:r>
                 </w:p>
               </w:tc>
@@ -40899,7 +40899,7 @@
                     <w:jc w:val="center"/>
                   </w:pPr>
                   <w:r>
-                    <w:t xml:space="preserve">-2.645</w:t>
+                    <w:t xml:space="preserve">-1.561</w:t>
                   </w:r>
                 </w:p>
               </w:tc>
@@ -40912,7 +40912,7 @@
                     <w:jc w:val="center"/>
                   </w:pPr>
                   <w:r>
-                    <w:t xml:space="preserve">1.077</w:t>
+                    <w:t xml:space="preserve">1.248</w:t>
                   </w:r>
                 </w:p>
               </w:tc>
@@ -40966,7 +40966,7 @@
                     <w:jc w:val="center"/>
                   </w:pPr>
                   <w:r>
-                    <w:t xml:space="preserve">0.09484</w:t>
+                    <w:t xml:space="preserve">-0.0449</w:t>
                   </w:r>
                 </w:p>
               </w:tc>
@@ -40979,7 +40979,7 @@
                     <w:jc w:val="center"/>
                   </w:pPr>
                   <w:r>
-                    <w:t xml:space="preserve">0.06476</w:t>
+                    <w:t xml:space="preserve">0.06845</w:t>
                   </w:r>
                 </w:p>
               </w:tc>

</xml_diff>

<commit_message>
Deploying to gh-pages from @ Morrison-Lab/rme@8e4d48273afcd40edd44c3d0b7aa230138173719 🚀
</commit_message>
<xml_diff>
--- a/chapters/count-regression-handout.docx
+++ b/chapters/count-regression-handout.docx
@@ -39407,7 +39407,7 @@
               <w:rPr>
                 <w:rStyle w:val="CommentTok"/>
               </w:rPr>
-              <w:t xml:space="preserve">#&gt;     hivstat + sexabuse + hplsns, data = needles, init.theta = 0.0903642555, </w:t>
+              <w:t xml:space="preserve">#&gt;     hivstat + sexabuse + hplsns, data = needles, init.theta = 0.08315440712, </w:t>
             </w:r>
             <w:r>
               <w:br/>
@@ -39443,7 +39443,7 @@
               <w:rPr>
                 <w:rStyle w:val="CommentTok"/>
               </w:rPr>
-              <w:t xml:space="preserve">#&gt;                             Estimate Std. Error z value Pr(&gt;|z|)   </w:t>
+              <w:t xml:space="preserve">#&gt;                             Estimate Std. Error z value Pr(&gt;|z|)    </w:t>
             </w:r>
             <w:r>
               <w:br/>
@@ -39452,7 +39452,7 @@
               <w:rPr>
                 <w:rStyle w:val="CommentTok"/>
               </w:rPr>
-              <w:t xml:space="preserve">#&gt; (Intercept)                   2.8948     1.9293    1.50   0.1335   </w:t>
+              <w:t xml:space="preserve">#&gt; (Intercept)                   6.4536     1.8421    3.50  0.00046 ***</w:t>
             </w:r>
             <w:r>
               <w:br/>
@@ -39461,7 +39461,7 @@
               <w:rPr>
                 <w:rStyle w:val="CommentTok"/>
               </w:rPr>
-              <w:t xml:space="preserve">#&gt; homelesshomeless              2.5534     0.8024    3.18   0.0015 **</w:t>
+              <w:t xml:space="preserve">#&gt; homelesshomeless              1.1508     0.7366    1.56  0.11820    </w:t>
             </w:r>
             <w:r>
               <w:br/>
@@ -39470,7 +39470,7 @@
               <w:rPr>
                 <w:rStyle w:val="CommentTok"/>
               </w:rPr>
-              <w:t xml:space="preserve">#&gt; age                          -0.0729     0.0447   -1.63   0.1027   </w:t>
+              <w:t xml:space="preserve">#&gt; age                          -0.1485     0.0433   -3.43  0.00059 ***</w:t>
             </w:r>
             <w:r>
               <w:br/>
@@ -39479,7 +39479,7 @@
               <w:rPr>
                 <w:rStyle w:val="CommentTok"/>
               </w:rPr>
-              <w:t xml:space="preserve">#&gt; sexF                         -0.5545     0.8869   -0.63   0.5318   </w:t>
+              <w:t xml:space="preserve">#&gt; sexF                          0.2198     0.8179    0.27  0.78813    </w:t>
             </w:r>
             <w:r>
               <w:br/>
@@ -39488,7 +39488,7 @@
               <w:rPr>
                 <w:rStyle w:val="CommentTok"/>
               </w:rPr>
-              <w:t xml:space="preserve">#&gt; ethnAA                        0.9100     0.9416    0.97   0.3339   </w:t>
+              <w:t xml:space="preserve">#&gt; ethnAA                        1.5958     0.8890    1.79  0.07265 .  </w:t>
             </w:r>
             <w:r>
               <w:br/>
@@ -39497,7 +39497,7 @@
               <w:rPr>
                 <w:rStyle w:val="CommentTok"/>
               </w:rPr>
-              <w:t xml:space="preserve">#&gt; ethnHispanic                  2.6222     1.5835    1.66   0.0977 . </w:t>
+              <w:t xml:space="preserve">#&gt; ethnHispanic                  3.7763     1.5240    2.48  0.01322 *  </w:t>
             </w:r>
             <w:r>
               <w:br/>
@@ -39506,7 +39506,7 @@
               <w:rPr>
                 <w:rStyle w:val="CommentTok"/>
               </w:rPr>
-              <w:t xml:space="preserve">#&gt; ethnOther                    -1.5963     2.1745   -0.73   0.4629   </w:t>
+              <w:t xml:space="preserve">#&gt; ethnOther                    -3.2365     2.2663   -1.43  0.15327    </w:t>
             </w:r>
             <w:r>
               <w:br/>
@@ -39515,7 +39515,7 @@
               <w:rPr>
                 <w:rStyle w:val="CommentTok"/>
               </w:rPr>
-              <w:t xml:space="preserve">#&gt; polydrugmultiple drugs used  -3.7062     1.3330   -2.78   0.0054 **</w:t>
+              <w:t xml:space="preserve">#&gt; polydrugmultiple drugs used  -4.0532     1.0898   -3.72  0.00020 ***</w:t>
             </w:r>
             <w:r>
               <w:br/>
@@ -39524,7 +39524,7 @@
               <w:rPr>
                 <w:rStyle w:val="CommentTok"/>
               </w:rPr>
-              <w:t xml:space="preserve">#&gt; hivstatHIV+                  -3.4809     1.5036   -2.32   0.0206 * </w:t>
+              <w:t xml:space="preserve">#&gt; hivstatHIV+                  -1.1548     1.3185   -0.88  0.38113    </w:t>
             </w:r>
             <w:r>
               <w:br/>
@@ -39533,7 +39533,7 @@
               <w:rPr>
                 <w:rStyle w:val="CommentTok"/>
               </w:rPr>
-              <w:t xml:space="preserve">#&gt; sexabuseyes                  -1.5612     1.2484   -1.25   0.2111   </w:t>
+              <w:t xml:space="preserve">#&gt; sexabuseyes                  -2.6449     1.0772   -2.46  0.01408 *  </w:t>
             </w:r>
             <w:r>
               <w:br/>
@@ -39542,7 +39542,7 @@
               <w:rPr>
                 <w:rStyle w:val="CommentTok"/>
               </w:rPr>
-              <w:t xml:space="preserve">#&gt; hplsns                       -0.0449     0.0685   -0.66   0.5119   </w:t>
+              <w:t xml:space="preserve">#&gt; hplsns                        0.0948     0.0648    1.46  0.14306    </w:t>
             </w:r>
             <w:r>
               <w:br/>
@@ -39578,7 +39578,7 @@
               <w:rPr>
                 <w:rStyle w:val="CommentTok"/>
               </w:rPr>
-              <w:t xml:space="preserve">#&gt; (Dispersion parameter for Negative Binomial(0.0899) family taken to be 1)</w:t>
+              <w:t xml:space="preserve">#&gt; (Dispersion parameter for Negative Binomial(0.0913) family taken to be 1)</w:t>
             </w:r>
             <w:r>
               <w:br/>
@@ -39596,7 +39596,7 @@
               <w:rPr>
                 <w:rStyle w:val="CommentTok"/>
               </w:rPr>
-              <w:t xml:space="preserve">#&gt;     Null deviance: 61.511  on 108  degrees of freedom</w:t>
+              <w:t xml:space="preserve">#&gt;     Null deviance: 62.231  on 108  degrees of freedom</w:t>
             </w:r>
             <w:r>
               <w:br/>
@@ -39605,7 +39605,7 @@
               <w:rPr>
                 <w:rStyle w:val="CommentTok"/>
               </w:rPr>
-              <w:t xml:space="preserve">#&gt; Residual deviance: 52.284  on  98  degrees of freedom</w:t>
+              <w:t xml:space="preserve">#&gt; Residual deviance: 60.031  on  98  degrees of freedom</w:t>
             </w:r>
             <w:r>
               <w:br/>
@@ -39623,7 +39623,7 @@
               <w:rPr>
                 <w:rStyle w:val="CommentTok"/>
               </w:rPr>
-              <w:t xml:space="preserve">#&gt; AIC: 261.5</w:t>
+              <w:t xml:space="preserve">#&gt; AIC: 267.9</w:t>
             </w:r>
             <w:r>
               <w:br/>
@@ -39668,7 +39668,7 @@
               <w:rPr>
                 <w:rStyle w:val="CommentTok"/>
               </w:rPr>
-              <w:t xml:space="preserve">#&gt;               Theta:  0.0904 </w:t>
+              <w:t xml:space="preserve">#&gt;               Theta:  0.0832 </w:t>
             </w:r>
             <w:r>
               <w:br/>
@@ -39677,7 +39677,7 @@
               <w:rPr>
                 <w:rStyle w:val="CommentTok"/>
               </w:rPr>
-              <w:t xml:space="preserve">#&gt;           Std. Err.:  0.0239 </w:t>
+              <w:t xml:space="preserve">#&gt;           Std. Err.:  0.0216 </w:t>
             </w:r>
             <w:r>
               <w:br/>
@@ -39704,7 +39704,7 @@
               <w:rPr>
                 <w:rStyle w:val="CommentTok"/>
               </w:rPr>
-              <w:t xml:space="preserve">#&gt;  2 x log-likelihood:  -237.5430</w:t>
+              <w:t xml:space="preserve">#&gt;  2 x log-likelihood:  -243.8880</w:t>
             </w:r>
           </w:p>
           <w:bookmarkEnd w:id="88"/>
@@ -40171,11 +40171,11 @@
               <w:tblLook w:firstRow="1" w:lastRow="0" w:firstColumn="0" w:lastColumn="0" w:noHBand="0" w:noVBand="0" w:val="0020"/>
             </w:tblPr>
             <w:tblGrid>
-              <w:gridCol w:w="2970"/>
-              <w:gridCol w:w="1485"/>
-              <w:gridCol w:w="1287"/>
-              <w:gridCol w:w="1089"/>
-              <w:gridCol w:w="1089"/>
+              <w:gridCol w:w="3046"/>
+              <w:gridCol w:w="1523"/>
+              <w:gridCol w:w="1320"/>
+              <w:gridCol w:w="1015"/>
+              <w:gridCol w:w="1015"/>
             </w:tblGrid>
             <w:tr>
               <w:trPr>
@@ -40296,7 +40296,7 @@
                     <w:jc w:val="center"/>
                   </w:pPr>
                   <w:r>
-                    <w:t xml:space="preserve">2.895</w:t>
+                    <w:t xml:space="preserve">6.454</w:t>
                   </w:r>
                 </w:p>
               </w:tc>
@@ -40309,7 +40309,7 @@
                     <w:jc w:val="center"/>
                   </w:pPr>
                   <w:r>
-                    <w:t xml:space="preserve">1.929</w:t>
+                    <w:t xml:space="preserve">1.842</w:t>
                   </w:r>
                 </w:p>
               </w:tc>
@@ -40363,7 +40363,7 @@
                     <w:jc w:val="center"/>
                   </w:pPr>
                   <w:r>
-                    <w:t xml:space="preserve">2.553</w:t>
+                    <w:t xml:space="preserve">1.151</w:t>
                   </w:r>
                 </w:p>
               </w:tc>
@@ -40376,7 +40376,7 @@
                     <w:jc w:val="center"/>
                   </w:pPr>
                   <w:r>
-                    <w:t xml:space="preserve">0.8024</w:t>
+                    <w:t xml:space="preserve">0.7366</w:t>
                   </w:r>
                 </w:p>
               </w:tc>
@@ -40430,7 +40430,7 @@
                     <w:jc w:val="center"/>
                   </w:pPr>
                   <w:r>
-                    <w:t xml:space="preserve">-0.07291</w:t>
+                    <w:t xml:space="preserve">-0.1485</w:t>
                   </w:r>
                 </w:p>
               </w:tc>
@@ -40443,7 +40443,7 @@
                     <w:jc w:val="center"/>
                   </w:pPr>
                   <w:r>
-                    <w:t xml:space="preserve">0.04468</w:t>
+                    <w:t xml:space="preserve">0.04326</w:t>
                   </w:r>
                 </w:p>
               </w:tc>
@@ -40497,7 +40497,7 @@
                     <w:jc w:val="center"/>
                   </w:pPr>
                   <w:r>
-                    <w:t xml:space="preserve">-0.5545</w:t>
+                    <w:t xml:space="preserve">0.2198</w:t>
                   </w:r>
                 </w:p>
               </w:tc>
@@ -40510,7 +40510,7 @@
                     <w:jc w:val="center"/>
                   </w:pPr>
                   <w:r>
-                    <w:t xml:space="preserve">0.8869</w:t>
+                    <w:t xml:space="preserve">0.8179</w:t>
                   </w:r>
                 </w:p>
               </w:tc>
@@ -40564,7 +40564,7 @@
                     <w:jc w:val="center"/>
                   </w:pPr>
                   <w:r>
-                    <w:t xml:space="preserve">0.91</w:t>
+                    <w:t xml:space="preserve">1.596</w:t>
                   </w:r>
                 </w:p>
               </w:tc>
@@ -40577,7 +40577,7 @@
                     <w:jc w:val="center"/>
                   </w:pPr>
                   <w:r>
-                    <w:t xml:space="preserve">0.9416</w:t>
+                    <w:t xml:space="preserve">0.889</w:t>
                   </w:r>
                 </w:p>
               </w:tc>
@@ -40631,7 +40631,7 @@
                     <w:jc w:val="center"/>
                   </w:pPr>
                   <w:r>
-                    <w:t xml:space="preserve">2.622</w:t>
+                    <w:t xml:space="preserve">3.776</w:t>
                   </w:r>
                 </w:p>
               </w:tc>
@@ -40644,7 +40644,7 @@
                     <w:jc w:val="center"/>
                   </w:pPr>
                   <w:r>
-                    <w:t xml:space="preserve">1.584</w:t>
+                    <w:t xml:space="preserve">1.524</w:t>
                   </w:r>
                 </w:p>
               </w:tc>
@@ -40698,7 +40698,7 @@
                     <w:jc w:val="center"/>
                   </w:pPr>
                   <w:r>
-                    <w:t xml:space="preserve">-1.596</w:t>
+                    <w:t xml:space="preserve">-3.236</w:t>
                   </w:r>
                 </w:p>
               </w:tc>
@@ -40711,7 +40711,7 @@
                     <w:jc w:val="center"/>
                   </w:pPr>
                   <w:r>
-                    <w:t xml:space="preserve">2.175</w:t>
+                    <w:t xml:space="preserve">2.266</w:t>
                   </w:r>
                 </w:p>
               </w:tc>
@@ -40765,7 +40765,7 @@
                     <w:jc w:val="center"/>
                   </w:pPr>
                   <w:r>
-                    <w:t xml:space="preserve">-3.706</w:t>
+                    <w:t xml:space="preserve">-4.053</w:t>
                   </w:r>
                 </w:p>
               </w:tc>
@@ -40778,7 +40778,7 @@
                     <w:jc w:val="center"/>
                   </w:pPr>
                   <w:r>
-                    <w:t xml:space="preserve">1.333</w:t>
+                    <w:t xml:space="preserve">1.09</w:t>
                   </w:r>
                 </w:p>
               </w:tc>
@@ -40832,7 +40832,7 @@
                     <w:jc w:val="center"/>
                   </w:pPr>
                   <w:r>
-                    <w:t xml:space="preserve">-3.481</w:t>
+                    <w:t xml:space="preserve">-1.155</w:t>
                   </w:r>
                 </w:p>
               </w:tc>
@@ -40845,7 +40845,7 @@
                     <w:jc w:val="center"/>
                   </w:pPr>
                   <w:r>
-                    <w:t xml:space="preserve">1.504</w:t>
+                    <w:t xml:space="preserve">1.319</w:t>
                   </w:r>
                 </w:p>
               </w:tc>
@@ -40899,7 +40899,7 @@
                     <w:jc w:val="center"/>
                   </w:pPr>
                   <w:r>
-                    <w:t xml:space="preserve">-1.561</w:t>
+                    <w:t xml:space="preserve">-2.645</w:t>
                   </w:r>
                 </w:p>
               </w:tc>
@@ -40912,7 +40912,7 @@
                     <w:jc w:val="center"/>
                   </w:pPr>
                   <w:r>
-                    <w:t xml:space="preserve">1.248</w:t>
+                    <w:t xml:space="preserve">1.077</w:t>
                   </w:r>
                 </w:p>
               </w:tc>
@@ -40966,7 +40966,7 @@
                     <w:jc w:val="center"/>
                   </w:pPr>
                   <w:r>
-                    <w:t xml:space="preserve">-0.0449</w:t>
+                    <w:t xml:space="preserve">0.09484</w:t>
                   </w:r>
                 </w:p>
               </w:tc>
@@ -40979,7 +40979,7 @@
                     <w:jc w:val="center"/>
                   </w:pPr>
                   <w:r>
-                    <w:t xml:space="preserve">0.06845</w:t>
+                    <w:t xml:space="preserve">0.06476</w:t>
                   </w:r>
                 </w:p>
               </w:tc>

</xml_diff>

<commit_message>
Deploying to gh-pages from @ Morrison-Lab/rme@9f5ac28c64cfd981a045ded736b1d4f56f695d89 🚀
</commit_message>
<xml_diff>
--- a/chapters/count-regression-handout.docx
+++ b/chapters/count-regression-handout.docx
@@ -39407,7 +39407,7 @@
               <w:rPr>
                 <w:rStyle w:val="CommentTok"/>
               </w:rPr>
-              <w:t xml:space="preserve">#&gt;     hivstat + sexabuse + hplsns, data = needles, init.theta = 0.08315440712, </w:t>
+              <w:t xml:space="preserve">#&gt;     hivstat + sexabuse + hplsns, data = needles, init.theta = 0.0903642555, </w:t>
             </w:r>
             <w:r>
               <w:br/>
@@ -39443,7 +39443,7 @@
               <w:rPr>
                 <w:rStyle w:val="CommentTok"/>
               </w:rPr>
-              <w:t xml:space="preserve">#&gt;                             Estimate Std. Error z value Pr(&gt;|z|)    </w:t>
+              <w:t xml:space="preserve">#&gt;                             Estimate Std. Error z value Pr(&gt;|z|)   </w:t>
             </w:r>
             <w:r>
               <w:br/>
@@ -39452,7 +39452,7 @@
               <w:rPr>
                 <w:rStyle w:val="CommentTok"/>
               </w:rPr>
-              <w:t xml:space="preserve">#&gt; (Intercept)                   6.4536     1.8421    3.50  0.00046 ***</w:t>
+              <w:t xml:space="preserve">#&gt; (Intercept)                   2.8948     1.9293    1.50   0.1335   </w:t>
             </w:r>
             <w:r>
               <w:br/>
@@ -39461,7 +39461,7 @@
               <w:rPr>
                 <w:rStyle w:val="CommentTok"/>
               </w:rPr>
-              <w:t xml:space="preserve">#&gt; homelesshomeless              1.1508     0.7366    1.56  0.11820    </w:t>
+              <w:t xml:space="preserve">#&gt; homelesshomeless              2.5534     0.8024    3.18   0.0015 **</w:t>
             </w:r>
             <w:r>
               <w:br/>
@@ -39470,7 +39470,7 @@
               <w:rPr>
                 <w:rStyle w:val="CommentTok"/>
               </w:rPr>
-              <w:t xml:space="preserve">#&gt; age                          -0.1485     0.0433   -3.43  0.00059 ***</w:t>
+              <w:t xml:space="preserve">#&gt; age                          -0.0729     0.0447   -1.63   0.1027   </w:t>
             </w:r>
             <w:r>
               <w:br/>
@@ -39479,7 +39479,7 @@
               <w:rPr>
                 <w:rStyle w:val="CommentTok"/>
               </w:rPr>
-              <w:t xml:space="preserve">#&gt; sexF                          0.2198     0.8179    0.27  0.78813    </w:t>
+              <w:t xml:space="preserve">#&gt; sexF                         -0.5545     0.8869   -0.63   0.5318   </w:t>
             </w:r>
             <w:r>
               <w:br/>
@@ -39488,7 +39488,7 @@
               <w:rPr>
                 <w:rStyle w:val="CommentTok"/>
               </w:rPr>
-              <w:t xml:space="preserve">#&gt; ethnAA                        1.5958     0.8890    1.79  0.07265 .  </w:t>
+              <w:t xml:space="preserve">#&gt; ethnAA                        0.9100     0.9416    0.97   0.3339   </w:t>
             </w:r>
             <w:r>
               <w:br/>
@@ -39497,7 +39497,7 @@
               <w:rPr>
                 <w:rStyle w:val="CommentTok"/>
               </w:rPr>
-              <w:t xml:space="preserve">#&gt; ethnHispanic                  3.7763     1.5240    2.48  0.01322 *  </w:t>
+              <w:t xml:space="preserve">#&gt; ethnHispanic                  2.6222     1.5835    1.66   0.0977 . </w:t>
             </w:r>
             <w:r>
               <w:br/>
@@ -39506,7 +39506,7 @@
               <w:rPr>
                 <w:rStyle w:val="CommentTok"/>
               </w:rPr>
-              <w:t xml:space="preserve">#&gt; ethnOther                    -3.2365     2.2663   -1.43  0.15327    </w:t>
+              <w:t xml:space="preserve">#&gt; ethnOther                    -1.5963     2.1745   -0.73   0.4629   </w:t>
             </w:r>
             <w:r>
               <w:br/>
@@ -39515,7 +39515,7 @@
               <w:rPr>
                 <w:rStyle w:val="CommentTok"/>
               </w:rPr>
-              <w:t xml:space="preserve">#&gt; polydrugmultiple drugs used  -4.0532     1.0898   -3.72  0.00020 ***</w:t>
+              <w:t xml:space="preserve">#&gt; polydrugmultiple drugs used  -3.7062     1.3330   -2.78   0.0054 **</w:t>
             </w:r>
             <w:r>
               <w:br/>
@@ -39524,7 +39524,7 @@
               <w:rPr>
                 <w:rStyle w:val="CommentTok"/>
               </w:rPr>
-              <w:t xml:space="preserve">#&gt; hivstatHIV+                  -1.1548     1.3185   -0.88  0.38113    </w:t>
+              <w:t xml:space="preserve">#&gt; hivstatHIV+                  -3.4809     1.5036   -2.32   0.0206 * </w:t>
             </w:r>
             <w:r>
               <w:br/>
@@ -39533,7 +39533,7 @@
               <w:rPr>
                 <w:rStyle w:val="CommentTok"/>
               </w:rPr>
-              <w:t xml:space="preserve">#&gt; sexabuseyes                  -2.6449     1.0772   -2.46  0.01408 *  </w:t>
+              <w:t xml:space="preserve">#&gt; sexabuseyes                  -1.5612     1.2484   -1.25   0.2111   </w:t>
             </w:r>
             <w:r>
               <w:br/>
@@ -39542,7 +39542,7 @@
               <w:rPr>
                 <w:rStyle w:val="CommentTok"/>
               </w:rPr>
-              <w:t xml:space="preserve">#&gt; hplsns                        0.0948     0.0648    1.46  0.14306    </w:t>
+              <w:t xml:space="preserve">#&gt; hplsns                       -0.0449     0.0685   -0.66   0.5119   </w:t>
             </w:r>
             <w:r>
               <w:br/>
@@ -39578,7 +39578,7 @@
               <w:rPr>
                 <w:rStyle w:val="CommentTok"/>
               </w:rPr>
-              <w:t xml:space="preserve">#&gt; (Dispersion parameter for Negative Binomial(0.0913) family taken to be 1)</w:t>
+              <w:t xml:space="preserve">#&gt; (Dispersion parameter for Negative Binomial(0.0899) family taken to be 1)</w:t>
             </w:r>
             <w:r>
               <w:br/>
@@ -39596,7 +39596,7 @@
               <w:rPr>
                 <w:rStyle w:val="CommentTok"/>
               </w:rPr>
-              <w:t xml:space="preserve">#&gt;     Null deviance: 62.231  on 108  degrees of freedom</w:t>
+              <w:t xml:space="preserve">#&gt;     Null deviance: 61.511  on 108  degrees of freedom</w:t>
             </w:r>
             <w:r>
               <w:br/>
@@ -39605,7 +39605,7 @@
               <w:rPr>
                 <w:rStyle w:val="CommentTok"/>
               </w:rPr>
-              <w:t xml:space="preserve">#&gt; Residual deviance: 60.031  on  98  degrees of freedom</w:t>
+              <w:t xml:space="preserve">#&gt; Residual deviance: 52.284  on  98  degrees of freedom</w:t>
             </w:r>
             <w:r>
               <w:br/>
@@ -39623,7 +39623,7 @@
               <w:rPr>
                 <w:rStyle w:val="CommentTok"/>
               </w:rPr>
-              <w:t xml:space="preserve">#&gt; AIC: 267.9</w:t>
+              <w:t xml:space="preserve">#&gt; AIC: 261.5</w:t>
             </w:r>
             <w:r>
               <w:br/>
@@ -39668,7 +39668,7 @@
               <w:rPr>
                 <w:rStyle w:val="CommentTok"/>
               </w:rPr>
-              <w:t xml:space="preserve">#&gt;               Theta:  0.0832 </w:t>
+              <w:t xml:space="preserve">#&gt;               Theta:  0.0904 </w:t>
             </w:r>
             <w:r>
               <w:br/>
@@ -39677,7 +39677,7 @@
               <w:rPr>
                 <w:rStyle w:val="CommentTok"/>
               </w:rPr>
-              <w:t xml:space="preserve">#&gt;           Std. Err.:  0.0216 </w:t>
+              <w:t xml:space="preserve">#&gt;           Std. Err.:  0.0239 </w:t>
             </w:r>
             <w:r>
               <w:br/>
@@ -39704,7 +39704,7 @@
               <w:rPr>
                 <w:rStyle w:val="CommentTok"/>
               </w:rPr>
-              <w:t xml:space="preserve">#&gt;  2 x log-likelihood:  -243.8880</w:t>
+              <w:t xml:space="preserve">#&gt;  2 x log-likelihood:  -237.5430</w:t>
             </w:r>
           </w:p>
           <w:bookmarkEnd w:id="88"/>
@@ -40171,11 +40171,11 @@
               <w:tblLook w:firstRow="1" w:lastRow="0" w:firstColumn="0" w:lastColumn="0" w:noHBand="0" w:noVBand="0" w:val="0020"/>
             </w:tblPr>
             <w:tblGrid>
-              <w:gridCol w:w="3046"/>
-              <w:gridCol w:w="1523"/>
-              <w:gridCol w:w="1320"/>
-              <w:gridCol w:w="1015"/>
-              <w:gridCol w:w="1015"/>
+              <w:gridCol w:w="2970"/>
+              <w:gridCol w:w="1485"/>
+              <w:gridCol w:w="1287"/>
+              <w:gridCol w:w="1089"/>
+              <w:gridCol w:w="1089"/>
             </w:tblGrid>
             <w:tr>
               <w:trPr>
@@ -40296,7 +40296,7 @@
                     <w:jc w:val="center"/>
                   </w:pPr>
                   <w:r>
-                    <w:t xml:space="preserve">6.454</w:t>
+                    <w:t xml:space="preserve">2.895</w:t>
                   </w:r>
                 </w:p>
               </w:tc>
@@ -40309,7 +40309,7 @@
                     <w:jc w:val="center"/>
                   </w:pPr>
                   <w:r>
-                    <w:t xml:space="preserve">1.842</w:t>
+                    <w:t xml:space="preserve">1.929</w:t>
                   </w:r>
                 </w:p>
               </w:tc>
@@ -40363,7 +40363,7 @@
                     <w:jc w:val="center"/>
                   </w:pPr>
                   <w:r>
-                    <w:t xml:space="preserve">1.151</w:t>
+                    <w:t xml:space="preserve">2.553</w:t>
                   </w:r>
                 </w:p>
               </w:tc>
@@ -40376,7 +40376,7 @@
                     <w:jc w:val="center"/>
                   </w:pPr>
                   <w:r>
-                    <w:t xml:space="preserve">0.7366</w:t>
+                    <w:t xml:space="preserve">0.8024</w:t>
                   </w:r>
                 </w:p>
               </w:tc>
@@ -40430,7 +40430,7 @@
                     <w:jc w:val="center"/>
                   </w:pPr>
                   <w:r>
-                    <w:t xml:space="preserve">-0.1485</w:t>
+                    <w:t xml:space="preserve">-0.07291</w:t>
                   </w:r>
                 </w:p>
               </w:tc>
@@ -40443,7 +40443,7 @@
                     <w:jc w:val="center"/>
                   </w:pPr>
                   <w:r>
-                    <w:t xml:space="preserve">0.04326</w:t>
+                    <w:t xml:space="preserve">0.04468</w:t>
                   </w:r>
                 </w:p>
               </w:tc>
@@ -40497,7 +40497,7 @@
                     <w:jc w:val="center"/>
                   </w:pPr>
                   <w:r>
-                    <w:t xml:space="preserve">0.2198</w:t>
+                    <w:t xml:space="preserve">-0.5545</w:t>
                   </w:r>
                 </w:p>
               </w:tc>
@@ -40510,7 +40510,7 @@
                     <w:jc w:val="center"/>
                   </w:pPr>
                   <w:r>
-                    <w:t xml:space="preserve">0.8179</w:t>
+                    <w:t xml:space="preserve">0.8869</w:t>
                   </w:r>
                 </w:p>
               </w:tc>
@@ -40564,7 +40564,7 @@
                     <w:jc w:val="center"/>
                   </w:pPr>
                   <w:r>
-                    <w:t xml:space="preserve">1.596</w:t>
+                    <w:t xml:space="preserve">0.91</w:t>
                   </w:r>
                 </w:p>
               </w:tc>
@@ -40577,7 +40577,7 @@
                     <w:jc w:val="center"/>
                   </w:pPr>
                   <w:r>
-                    <w:t xml:space="preserve">0.889</w:t>
+                    <w:t xml:space="preserve">0.9416</w:t>
                   </w:r>
                 </w:p>
               </w:tc>
@@ -40631,7 +40631,7 @@
                     <w:jc w:val="center"/>
                   </w:pPr>
                   <w:r>
-                    <w:t xml:space="preserve">3.776</w:t>
+                    <w:t xml:space="preserve">2.622</w:t>
                   </w:r>
                 </w:p>
               </w:tc>
@@ -40644,7 +40644,7 @@
                     <w:jc w:val="center"/>
                   </w:pPr>
                   <w:r>
-                    <w:t xml:space="preserve">1.524</w:t>
+                    <w:t xml:space="preserve">1.584</w:t>
                   </w:r>
                 </w:p>
               </w:tc>
@@ -40698,7 +40698,7 @@
                     <w:jc w:val="center"/>
                   </w:pPr>
                   <w:r>
-                    <w:t xml:space="preserve">-3.236</w:t>
+                    <w:t xml:space="preserve">-1.596</w:t>
                   </w:r>
                 </w:p>
               </w:tc>
@@ -40711,7 +40711,7 @@
                     <w:jc w:val="center"/>
                   </w:pPr>
                   <w:r>
-                    <w:t xml:space="preserve">2.266</w:t>
+                    <w:t xml:space="preserve">2.175</w:t>
                   </w:r>
                 </w:p>
               </w:tc>
@@ -40765,7 +40765,7 @@
                     <w:jc w:val="center"/>
                   </w:pPr>
                   <w:r>
-                    <w:t xml:space="preserve">-4.053</w:t>
+                    <w:t xml:space="preserve">-3.706</w:t>
                   </w:r>
                 </w:p>
               </w:tc>
@@ -40778,7 +40778,7 @@
                     <w:jc w:val="center"/>
                   </w:pPr>
                   <w:r>
-                    <w:t xml:space="preserve">1.09</w:t>
+                    <w:t xml:space="preserve">1.333</w:t>
                   </w:r>
                 </w:p>
               </w:tc>
@@ -40832,7 +40832,7 @@
                     <w:jc w:val="center"/>
                   </w:pPr>
                   <w:r>
-                    <w:t xml:space="preserve">-1.155</w:t>
+                    <w:t xml:space="preserve">-3.481</w:t>
                   </w:r>
                 </w:p>
               </w:tc>
@@ -40845,7 +40845,7 @@
                     <w:jc w:val="center"/>
                   </w:pPr>
                   <w:r>
-                    <w:t xml:space="preserve">1.319</w:t>
+                    <w:t xml:space="preserve">1.504</w:t>
                   </w:r>
                 </w:p>
               </w:tc>
@@ -40899,7 +40899,7 @@
                     <w:jc w:val="center"/>
                   </w:pPr>
                   <w:r>
-                    <w:t xml:space="preserve">-2.645</w:t>
+                    <w:t xml:space="preserve">-1.561</w:t>
                   </w:r>
                 </w:p>
               </w:tc>
@@ -40912,7 +40912,7 @@
                     <w:jc w:val="center"/>
                   </w:pPr>
                   <w:r>
-                    <w:t xml:space="preserve">1.077</w:t>
+                    <w:t xml:space="preserve">1.248</w:t>
                   </w:r>
                 </w:p>
               </w:tc>
@@ -40966,7 +40966,7 @@
                     <w:jc w:val="center"/>
                   </w:pPr>
                   <w:r>
-                    <w:t xml:space="preserve">0.09484</w:t>
+                    <w:t xml:space="preserve">-0.0449</w:t>
                   </w:r>
                 </w:p>
               </w:tc>
@@ -40979,7 +40979,7 @@
                     <w:jc w:val="center"/>
                   </w:pPr>
                   <w:r>
-                    <w:t xml:space="preserve">0.06476</w:t>
+                    <w:t xml:space="preserve">0.06845</w:t>
                   </w:r>
                 </w:p>
               </w:tc>

</xml_diff>

<commit_message>
Deploying to gh-pages from @ Morrison-Lab/rme@ffbb0976bd37669c985678fd6df124bdb700554f 🚀
</commit_message>
<xml_diff>
--- a/chapters/count-regression-handout.docx
+++ b/chapters/count-regression-handout.docx
@@ -1363,7 +1363,7 @@
     </w:p>
     <w:bookmarkEnd w:id="9"/>
     <w:bookmarkEnd w:id="10"/>
-    <w:bookmarkStart w:id="21" w:name="introduction"/>
+    <w:bookmarkStart w:id="26" w:name="introduction"/>
     <w:p>
       <w:pPr>
         <w:pStyle w:val="Heading1"/>
@@ -1372,9 +1372,200 @@
         <w:t xml:space="preserve">1. Introduction</w:t>
       </w:r>
     </w:p>
+    <w:tbl>
+      <w:tblPr>
+        <w:tblStyle w:val="Table"/>
+        <w:tblLook w:firstRow="0" w:lastRow="0" w:firstColumn="0" w:lastColumn="0" w:noHBand="0" w:noVBand="0" w:val="0000"/>
+        <w:tblBorders>
+          <w:top w:val="single" w:sz="4" w:space="0" w:color="00A047"/>
+          <w:left w:val="single" w:sz="24" w:space="0" w:color="00A047"/>
+          <w:bottom w:val="single" w:sz="4" w:space="0" w:color="00A047"/>
+          <w:right w:val="single" w:sz="4" w:space="0" w:color="00A047"/>
+        </w:tblBorders>
+        <w:tblCellMar>
+          <w:left w:w="144" w:type="dxa"/>
+          <w:right w:w="144" w:type="dxa"/>
+        </w:tblCellMar>
+        <w:tblLook w:firstRow="0" w:lastRow="0" w:firstColumn="0" w:lastColumn="0" w:noHBand="0" w:noVBand="0" w:val="0000"/>
+      </w:tblPr>
+      <w:tr>
+        <w:trPr>
+          <w:cantSplit/>
+        </w:trPr>
+        <w:tc>
+          <w:tcPr>
+            <w:shd w:color="auto" w:fill="ccf1e3" w:val="clear"/>
+            <w:tcMar>
+              <w:top w:w="92" w:type="dxa"/>
+              <w:bottom w:w="92" w:type="dxa"/>
+            </w:tcMar>
+          </w:tcPr>
+          <w:p>
+            <w:pPr>
+              <w:pStyle w:val="FirstParagraph"/>
+            </w:pPr>
+            <w:pPr>
+              <w:spacing w:before="0" w:after="0"/>
+              <w:textAlignment w:val="center"/>
+            </w:pPr>
+            <w:r>
+              <w:drawing>
+                <wp:inline>
+                  <wp:extent cx="152400" cy="152400"/>
+                  <wp:effectExtent b="0" l="0" r="0" t="0"/>
+                  <wp:docPr descr="" title="" id="12" name="Picture"/>
+                  <a:graphic>
+                    <a:graphicData uri="http://schemas.openxmlformats.org/drawingml/2006/picture">
+                      <pic:pic>
+                        <pic:nvPicPr>
+                          <pic:cNvPr descr="/opt/quarto/share/formats/docx/tip.png" id="13" name="Picture"/>
+                          <pic:cNvPicPr>
+                            <a:picLocks noChangeArrowheads="1" noChangeAspect="1"/>
+                          </pic:cNvPicPr>
+                        </pic:nvPicPr>
+                        <pic:blipFill>
+                          <a:blip r:embed="rId11"/>
+                          <a:stretch>
+                            <a:fillRect/>
+                          </a:stretch>
+                        </pic:blipFill>
+                        <pic:spPr bwMode="auto">
+                          <a:xfrm>
+                            <a:off x="0" y="0"/>
+                            <a:ext cx="152400" cy="152400"/>
+                          </a:xfrm>
+                          <a:prstGeom prst="rect">
+                            <a:avLst/>
+                          </a:prstGeom>
+                          <a:noFill/>
+                          <a:ln w="9525">
+                            <a:noFill/>
+                            <a:headEnd/>
+                            <a:tailEnd/>
+                          </a:ln>
+                        </pic:spPr>
+                      </pic:pic>
+                    </a:graphicData>
+                  </a:graphic>
+                </wp:inline>
+              </w:drawing>
+            </w:r>
+            <w:r>
+              <w:t xml:space="preserve"> </w:t>
+            </w:r>
+            <w:r>
+              <w:t xml:space="preserve"> </w:t>
+            </w:r>
+            <w:r>
+              <w:t xml:space="preserve">Video lecture</w:t>
+            </w:r>
+          </w:p>
+        </w:tc>
+      </w:tr>
+      <w:tr>
+        <w:trPr>
+          <w:cantSplit/>
+        </w:trPr>
+        <w:tc>
+          <w:tcPr>
+            <w:tcMar>
+              <w:top w:w="108" w:type="dxa"/>
+              <w:bottom w:w="108" w:type="dxa"/>
+            </w:tcMar>
+          </w:tcPr>
+          <w:p>
+            <w:pPr>
+              <w:pStyle w:val="BodyText"/>
+            </w:pPr>
+            <w:pPr>
+              <w:spacing w:before="16" w:after="16"/>
+            </w:pPr>
+            <w:r>
+              <w:t xml:space="preserve">David Rocke’s Epi 204 lecture</w:t>
+            </w:r>
+            <w:r>
+              <w:t xml:space="preserve"> </w:t>
+            </w:r>
+            <w:hyperlink r:id="rId14">
+              <w:r>
+                <w:rPr>
+                  <w:rStyle w:val="Hyperlink"/>
+                  <w:i/>
+                  <w:iCs/>
+                </w:rPr>
+                <w:t xml:space="preserve">Poisson Regression</w:t>
+              </w:r>
+            </w:hyperlink>
+            <w:r>
+              <w:t xml:space="preserve"> </w:t>
+            </w:r>
+            <w:r>
+              <w:t xml:space="preserve">(</w:t>
+            </w:r>
+            <w:hyperlink r:id="rId15">
+              <w:r>
+                <w:rPr>
+                  <w:rStyle w:val="Hyperlink"/>
+                </w:rPr>
+                <w:t xml:space="preserve">slides</w:t>
+              </w:r>
+            </w:hyperlink>
+            <w:r>
+              <w:t xml:space="preserve">)</w:t>
+            </w:r>
+            <w:r>
+              <w:t xml:space="preserve"> </w:t>
+            </w:r>
+            <w:r>
+              <w:t xml:space="preserve">covers Poisson regression with a log link and a population offset,</w:t>
+            </w:r>
+            <w:r>
+              <w:t xml:space="preserve"> </w:t>
+            </w:r>
+            <w:r>
+              <w:t xml:space="preserve">rate ratios,</w:t>
+            </w:r>
+            <w:r>
+              <w:t xml:space="preserve"> </w:t>
+            </w:r>
+            <w:r>
+              <w:t xml:space="preserve">residual diagnostics,</w:t>
+            </w:r>
+            <w:r>
+              <w:t xml:space="preserve"> </w:t>
+            </w:r>
+            <w:r>
+              <w:t xml:space="preserve">goodness of fit,</w:t>
+            </w:r>
+            <w:r>
+              <w:t xml:space="preserve"> </w:t>
+            </w:r>
+            <w:r>
+              <w:t xml:space="preserve">and overdispersion,</w:t>
+            </w:r>
+            <w:r>
+              <w:t xml:space="preserve"> </w:t>
+            </w:r>
+            <w:r>
+              <w:t xml:space="preserve">using Danish lung cancer incidence data</w:t>
+            </w:r>
+            <w:r>
+              <w:t xml:space="preserve"> </w:t>
+            </w:r>
+            <w:r>
+              <w:t xml:space="preserve">(Rocke 2021)</w:t>
+            </w:r>
+            <w:r>
+              <w:t xml:space="preserve">.</w:t>
+            </w:r>
+          </w:p>
+          <w:p/>
+        </w:tc>
+      </w:tr>
+    </w:tbl>
     <w:p>
       <w:pPr>
-        <w:pStyle w:val="FirstParagraph"/>
+        <w:pStyle w:val="BodyText"/>
       </w:pPr>
       <w:r>
         <w:t xml:space="preserve">This chapter presents models for</w:t>
@@ -1382,7 +1573,7 @@
       <w:r>
         <w:t xml:space="preserve"> </w:t>
       </w:r>
-      <w:hyperlink r:id="rId11">
+      <w:hyperlink r:id="rId16">
         <w:r>
           <w:rPr>
             <w:rStyle w:val="Hyperlink"/>
@@ -1633,7 +1824,7 @@
       <w:pPr>
         <w:pStyle w:val="BodyText"/>
       </w:pPr>
-      <w:bookmarkStart w:id="12" w:name="eq-mean-poisson"/>
+      <w:bookmarkStart w:id="17" w:name="eq-mean-poisson"/>
       <m:oMathPara>
         <m:oMathParaPr>
           <m:jc m:val="center"/>
@@ -2063,7 +2254,7 @@
           </m:r>
         </m:oMath>
       </m:oMathPara>
-      <w:bookmarkEnd w:id="12"/>
+      <w:bookmarkEnd w:id="17"/>
     </w:p>
     <w:p>
       <w:pPr>
@@ -2098,7 +2289,7 @@
       <w:r>
         <w:t xml:space="preserve"> </w:t>
       </w:r>
-      <w:hyperlink r:id="rId13">
+      <w:hyperlink r:id="rId18">
         <w:r>
           <w:rPr>
             <w:rStyle w:val="Hyperlink"/>
@@ -2160,7 +2351,7 @@
               <w:spacing w:before="16" w:after="64"/>
             </w:pPr>
           </w:p>
-          <w:bookmarkStart w:id="14" w:name="exr-analogy-pois-offset-binom"/>
+          <w:bookmarkStart w:id="19" w:name="exr-analogy-pois-offset-binom"/>
           <w:p>
             <w:pPr>
               <w:pStyle w:val="BodyText"/>
@@ -2220,7 +2411,7 @@
               <w:t xml:space="preserve">before?</w:t>
             </w:r>
           </w:p>
-          <w:bookmarkEnd w:id="14"/>
+          <w:bookmarkEnd w:id="19"/>
         </w:tc>
       </w:tr>
     </w:tbl>
@@ -2283,7 +2474,7 @@
               <w:bottom w:w="108" w:type="dxa"/>
             </w:tcMar>
           </w:tcPr>
-          <w:bookmarkStart w:id="15" w:name="sol-analogy-pois-offset-binom"/>
+          <w:bookmarkStart w:id="20" w:name="sol-analogy-pois-offset-binom"/>
           <w:p>
             <w:pPr>
               <w:pStyle w:val="BodyText"/>
@@ -2384,7 +2575,7 @@
               <w:t xml:space="preserve">in Binomial models.</w:t>
             </w:r>
           </w:p>
-          <w:bookmarkEnd w:id="15"/>
+          <w:bookmarkEnd w:id="20"/>
           <w:p/>
         </w:tc>
       </w:tr>
@@ -3314,7 +3505,7 @@
       <w:r>
         <w:t xml:space="preserve"> </w:t>
       </w:r>
-      <w:hyperlink r:id="rId16">
+      <w:hyperlink r:id="rId21">
         <w:r>
           <w:rPr>
             <w:rStyle w:val="Hyperlink"/>
@@ -3367,7 +3558,7 @@
               <w:spacing w:before="16" w:after="64"/>
             </w:pPr>
           </w:p>
-          <w:bookmarkStart w:id="17" w:name="exr-eq-mean-poisson"/>
+          <w:bookmarkStart w:id="22" w:name="exr-eq-mean-poisson"/>
           <w:p>
             <w:pPr>
               <w:pStyle w:val="BodyText"/>
@@ -3414,7 +3605,7 @@
               <w:t xml:space="preserve">?</w:t>
             </w:r>
           </w:p>
-          <w:bookmarkEnd w:id="17"/>
+          <w:bookmarkEnd w:id="22"/>
         </w:tc>
       </w:tr>
     </w:tbl>
@@ -3477,7 +3668,7 @@
               <w:bottom w:w="108" w:type="dxa"/>
             </w:tcMar>
           </w:tcPr>
-          <w:bookmarkStart w:id="18" w:name="sol-eq-mean-poisson"/>
+          <w:bookmarkStart w:id="23" w:name="sol-eq-mean-poisson"/>
           <w:p>
             <w:pPr>
               <w:pStyle w:val="BodyText"/>
@@ -3591,7 +3782,7 @@
               <w:t xml:space="preserve">15.01 infections.</w:t>
             </w:r>
           </w:p>
-          <w:bookmarkEnd w:id="18"/>
+          <w:bookmarkEnd w:id="23"/>
           <w:p/>
         </w:tc>
       </w:tr>
@@ -3637,7 +3828,7 @@
               <w:spacing w:before="16" w:after="64"/>
             </w:pPr>
           </w:p>
-          <w:bookmarkStart w:id="19" w:name="exr-eq-rate-poisson"/>
+          <w:bookmarkStart w:id="24" w:name="exr-eq-rate-poisson"/>
           <w:p>
             <w:pPr>
               <w:pStyle w:val="BodyText"/>
@@ -3684,7 +3875,7 @@
               <w:t xml:space="preserve">?</w:t>
             </w:r>
           </w:p>
-          <w:bookmarkEnd w:id="19"/>
+          <w:bookmarkEnd w:id="24"/>
         </w:tc>
       </w:tr>
     </w:tbl>
@@ -3747,7 +3938,7 @@
               <w:bottom w:w="108" w:type="dxa"/>
             </w:tcMar>
           </w:tcPr>
-          <w:bookmarkStart w:id="20" w:name="sol-eq-rate-poisson"/>
+          <w:bookmarkStart w:id="25" w:name="sol-eq-rate-poisson"/>
           <w:p>
             <w:pPr>
               <w:pStyle w:val="BodyText"/>
@@ -3875,13 +4066,13 @@
               <w:t xml:space="preserve">15.01 infections per 1000 person-years at risk.</w:t>
             </w:r>
           </w:p>
-          <w:bookmarkEnd w:id="20"/>
+          <w:bookmarkEnd w:id="25"/>
           <w:p/>
         </w:tc>
       </w:tr>
     </w:tbl>
-    <w:bookmarkEnd w:id="21"/>
-    <w:bookmarkStart w:id="24" w:name="interpreting-poisson-regression-models"/>
+    <w:bookmarkEnd w:id="26"/>
+    <w:bookmarkStart w:id="29" w:name="interpreting-poisson-regression-models"/>
     <w:p>
       <w:pPr>
         <w:pStyle w:val="Heading1"/>
@@ -3900,7 +4091,7 @@
       <w:r>
         <w:t xml:space="preserve"> </w:t>
       </w:r>
-      <w:hyperlink r:id="rId22">
+      <w:hyperlink r:id="rId27">
         <w:r>
           <w:rPr>
             <w:rStyle w:val="Hyperlink"/>
@@ -4182,7 +4373,7 @@
       <w:r>
         <w:t xml:space="preserve"> </w:t>
       </w:r>
-      <w:hyperlink r:id="rId23">
+      <w:hyperlink r:id="rId28">
         <w:r>
           <w:rPr>
             <w:rStyle w:val="Hyperlink"/>
@@ -5858,8 +6049,8 @@
         </m:oMath>
       </m:oMathPara>
     </w:p>
-    <w:bookmarkEnd w:id="24"/>
-    <w:bookmarkStart w:id="59" w:name="example-needle-sharing"/>
+    <w:bookmarkEnd w:id="29"/>
+    <w:bookmarkStart w:id="63" w:name="example-needle-sharing"/>
     <w:p>
       <w:pPr>
         <w:pStyle w:val="Heading1"/>
@@ -7934,7 +8125,7 @@
         <w:t xml:space="preserve">  )</w:t>
       </w:r>
     </w:p>
-    <w:bookmarkStart w:id="41" w:name="introduction-1"/>
+    <w:bookmarkStart w:id="46" w:name="introduction-1"/>
     <w:p>
       <w:pPr>
         <w:pStyle w:val="Heading2"/>
@@ -8058,7 +8249,7 @@
       <w:r>
         <w:t xml:space="preserve"> </w:t>
       </w:r>
-      <w:hyperlink r:id="rId25">
+      <w:hyperlink r:id="rId30">
         <w:r>
           <w:rPr>
             <w:rStyle w:val="Hyperlink"/>
@@ -8169,7 +8360,7 @@
       <w:tr>
         <w:tc>
           <w:tcPr/>
-          <w:bookmarkStart w:id="26" w:name="tbl-needles-data-dict"/>
+          <w:bookmarkStart w:id="31" w:name="tbl-needles-data-dict"/>
           <w:p>
             <w:pPr>
               <w:jc w:val="center"/>
@@ -9032,7 +9223,7 @@
               </w:tc>
             </w:tr>
           </w:tbl>
-          <w:bookmarkEnd w:id="26"/>
+          <w:bookmarkEnd w:id="31"/>
           <w:p/>
         </w:tc>
       </w:tr>
@@ -9082,7 +9273,7 @@
       <w:tr>
         <w:tc>
           <w:tcPr/>
-          <w:bookmarkStart w:id="27" w:name="tbl-needles-demographics"/>
+          <w:bookmarkStart w:id="32" w:name="tbl-needles-demographics"/>
           <w:p>
             <w:pPr>
               <w:jc w:val="center"/>
@@ -11473,7 +11664,7 @@
               </w:tc>
             </w:tr>
           </w:tbl>
-          <w:bookmarkEnd w:id="27"/>
+          <w:bookmarkEnd w:id="32"/>
         </w:tc>
       </w:tr>
     </w:tbl>
@@ -11504,7 +11695,7 @@
       <w:tr>
         <w:tc>
           <w:tcPr/>
-          <w:bookmarkStart w:id="31" w:name="fig-needles-dag"/>
+          <w:bookmarkStart w:id="36" w:name="fig-needles-dag"/>
           <w:p>
             <w:pPr>
               <w:pStyle w:val="SourceCode"/>
@@ -15456,18 +15647,18 @@
                 <wp:inline>
                   <wp:extent cx="5334000" cy="4078941"/>
                   <wp:effectExtent b="0" l="0" r="0" t="0"/>
-                  <wp:docPr descr="" title="" id="29" name="Picture"/>
+                  <wp:docPr descr="" title="" id="34" name="Picture"/>
                   <a:graphic>
                     <a:graphicData uri="http://schemas.openxmlformats.org/drawingml/2006/picture">
                       <pic:pic>
                         <pic:nvPicPr>
-                          <pic:cNvPr descr="count-regression_files/figure-docx/unnamed-chunk-4-1.png" id="30" name="Picture"/>
+                          <pic:cNvPr descr="count-regression_files/figure-docx/unnamed-chunk-4-1.png" id="35" name="Picture"/>
                           <pic:cNvPicPr>
                             <a:picLocks noChangeArrowheads="1" noChangeAspect="1"/>
                           </pic:cNvPicPr>
                         </pic:nvPicPr>
                         <pic:blipFill>
-                          <a:blip r:embed="rId28"/>
+                          <a:blip r:embed="rId33"/>
                           <a:stretch>
                             <a:fillRect/>
                           </a:stretch>
@@ -15721,7 +15912,7 @@
               <w:t xml:space="preserve">conditioning on it can induce associations among them (selection bias).</w:t>
             </w:r>
           </w:p>
-          <w:bookmarkEnd w:id="31"/>
+          <w:bookmarkEnd w:id="36"/>
         </w:tc>
       </w:tr>
     </w:tbl>
@@ -16093,7 +16284,7 @@
       <w:tr>
         <w:tc>
           <w:tcPr/>
-          <w:bookmarkStart w:id="32" w:name="tbl-needle-data"/>
+          <w:bookmarkStart w:id="37" w:name="tbl-needle-data"/>
           <w:p>
             <w:pPr>
               <w:jc w:val="center"/>
@@ -16263,7 +16454,7 @@
               <w:t xml:space="preserve">#&gt; #   polydrug &lt;fct&gt;, sqrtninj &lt;dbl&gt;, homeless &lt;fct&gt;, shsyr &lt;dbl&gt;</w:t>
             </w:r>
           </w:p>
-          <w:bookmarkEnd w:id="32"/>
+          <w:bookmarkEnd w:id="37"/>
         </w:tc>
       </w:tr>
     </w:tbl>
@@ -16965,7 +17156,7 @@
       <w:tr>
         <w:tc>
           <w:tcPr/>
-          <w:bookmarkStart w:id="36" w:name="fig-needles"/>
+          <w:bookmarkStart w:id="41" w:name="fig-needles"/>
           <w:p>
             <w:pPr>
               <w:pStyle w:val="Compact"/>
@@ -16976,18 +17167,18 @@
                 <wp:inline>
                   <wp:extent cx="5334000" cy="3137647"/>
                   <wp:effectExtent b="0" l="0" r="0" t="0"/>
-                  <wp:docPr descr="" title="" id="34" name="Picture"/>
+                  <wp:docPr descr="" title="" id="39" name="Picture"/>
                   <a:graphic>
                     <a:graphicData uri="http://schemas.openxmlformats.org/drawingml/2006/picture">
                       <pic:pic>
                         <pic:nvPicPr>
-                          <pic:cNvPr descr="count-regression_files/figure-docx/fig-needles-1.png" id="35" name="Picture"/>
+                          <pic:cNvPr descr="count-regression_files/figure-docx/fig-needles-1.png" id="40" name="Picture"/>
                           <pic:cNvPicPr>
                             <a:picLocks noChangeArrowheads="1" noChangeAspect="1"/>
                           </pic:cNvPicPr>
                         </pic:nvPicPr>
                         <pic:blipFill>
-                          <a:blip r:embed="rId33"/>
+                          <a:blip r:embed="rId38"/>
                           <a:stretch>
                             <a:fillRect/>
                           </a:stretch>
@@ -17027,7 +17218,7 @@
               <w:t xml:space="preserve">Figure 2: Needle-sharing counts by age</w:t>
             </w:r>
           </w:p>
-          <w:bookmarkEnd w:id="36"/>
+          <w:bookmarkEnd w:id="41"/>
         </w:tc>
       </w:tr>
     </w:tbl>
@@ -17104,7 +17295,7 @@
       <w:tr>
         <w:tc>
           <w:tcPr/>
-          <w:bookmarkStart w:id="40" w:name="fig-needles-raw"/>
+          <w:bookmarkStart w:id="45" w:name="fig-needles-raw"/>
           <w:p>
             <w:pPr>
               <w:pStyle w:val="SourceCode"/>
@@ -18077,18 +18268,18 @@
                 <wp:inline>
                   <wp:extent cx="5334000" cy="3137647"/>
                   <wp:effectExtent b="0" l="0" r="0" t="0"/>
-                  <wp:docPr descr="" title="" id="38" name="Picture"/>
+                  <wp:docPr descr="" title="" id="43" name="Picture"/>
                   <a:graphic>
                     <a:graphicData uri="http://schemas.openxmlformats.org/drawingml/2006/picture">
                       <pic:pic>
                         <pic:nvPicPr>
-                          <pic:cNvPr descr="count-regression_files/figure-docx/unnamed-chunk-5-1.png" id="39" name="Picture"/>
+                          <pic:cNvPr descr="count-regression_files/figure-docx/unnamed-chunk-5-1.png" id="44" name="Picture"/>
                           <pic:cNvPicPr>
                             <a:picLocks noChangeArrowheads="1" noChangeAspect="1"/>
                           </pic:cNvPicPr>
                         </pic:nvPicPr>
                         <pic:blipFill>
-                          <a:blip r:embed="rId37"/>
+                          <a:blip r:embed="rId42"/>
                           <a:stretch>
                             <a:fillRect/>
                           </a:stretch>
@@ -18163,7 +18354,7 @@
               <w:t xml:space="preserve">(every injection involves a shared syringe).</w:t>
             </w:r>
           </w:p>
-          <w:bookmarkEnd w:id="40"/>
+          <w:bookmarkEnd w:id="45"/>
         </w:tc>
       </w:tr>
     </w:tbl>
@@ -18174,8 +18365,8 @@
         </w:pict>
       </w:r>
     </w:p>
-    <w:bookmarkEnd w:id="41"/>
-    <w:bookmarkStart w:id="43" w:name="covariate-counts"/>
+    <w:bookmarkEnd w:id="46"/>
+    <w:bookmarkStart w:id="48" w:name="covariate-counts"/>
     <w:p>
       <w:pPr>
         <w:pStyle w:val="Heading2"/>
@@ -18197,7 +18388,7 @@
       <w:tr>
         <w:tc>
           <w:tcPr/>
-          <w:bookmarkStart w:id="42" w:name="tbl-count-needles"/>
+          <w:bookmarkStart w:id="47" w:name="tbl-count-needles"/>
           <w:p>
             <w:pPr>
               <w:jc w:val="center"/>
@@ -18334,7 +18525,7 @@
               <w:t xml:space="preserve">#&gt;  Trans: 1   NAs         : 4</w:t>
             </w:r>
           </w:p>
-          <w:bookmarkEnd w:id="42"/>
+          <w:bookmarkEnd w:id="47"/>
         </w:tc>
       </w:tr>
     </w:tbl>
@@ -18455,8 +18646,8 @@
         </w:pict>
       </w:r>
     </w:p>
-    <w:bookmarkEnd w:id="43"/>
-    <w:bookmarkStart w:id="54" w:name="model"/>
+    <w:bookmarkEnd w:id="48"/>
+    <w:bookmarkStart w:id="58" w:name="model"/>
     <w:p>
       <w:pPr>
         <w:pStyle w:val="Heading2"/>
@@ -18595,7 +18786,7 @@
               <w:spacing w:before="16" w:after="64"/>
             </w:pPr>
           </w:p>
-          <w:bookmarkStart w:id="44" w:name="exr-nivdu-offset"/>
+          <w:bookmarkStart w:id="49" w:name="exr-nivdu-offset"/>
           <w:p>
             <w:pPr>
               <w:pStyle w:val="BodyText"/>
@@ -18690,7 +18881,7 @@
               <w:t xml:space="preserve">as an offset here?</w:t>
             </w:r>
           </w:p>
-          <w:bookmarkEnd w:id="44"/>
+          <w:bookmarkEnd w:id="49"/>
         </w:tc>
       </w:tr>
     </w:tbl>
@@ -18746,7 +18937,7 @@
               <w:bottom w:w="108" w:type="dxa"/>
             </w:tcMar>
           </w:tcPr>
-          <w:bookmarkStart w:id="45" w:name="sol-nivdu-offset"/>
+          <w:bookmarkStart w:id="50" w:name="sol-nivdu-offset"/>
           <w:p>
             <w:pPr>
               <w:pStyle w:val="BodyText"/>
@@ -18914,7 +19105,7 @@
               <w:t xml:space="preserve">one-for-one with injecting, which the data need not support.</w:t>
             </w:r>
           </w:p>
-          <w:bookmarkEnd w:id="45"/>
+          <w:bookmarkEnd w:id="50"/>
           <w:p/>
         </w:tc>
       </w:tr>
@@ -18983,18 +19174,18 @@
                 <wp:inline>
                   <wp:extent cx="152400" cy="152400"/>
                   <wp:effectExtent b="0" l="0" r="0" t="0"/>
-                  <wp:docPr descr="" title="" id="47" name="Picture"/>
+                  <wp:docPr descr="" title="" id="51" name="Picture"/>
                   <a:graphic>
                     <a:graphicData uri="http://schemas.openxmlformats.org/drawingml/2006/picture">
                       <pic:pic>
                         <pic:nvPicPr>
-                          <pic:cNvPr descr="/opt/quarto/share/formats/docx/tip.png" id="48" name="Picture"/>
+                          <pic:cNvPr descr="/opt/quarto/share/formats/docx/tip.png" id="52" name="Picture"/>
                           <pic:cNvPicPr>
                             <a:picLocks noChangeArrowheads="1" noChangeAspect="1"/>
                           </pic:cNvPicPr>
                         </pic:nvPicPr>
                         <pic:blipFill>
-                          <a:blip r:embed="rId46"/>
+                          <a:blip r:embed="rId11"/>
                           <a:stretch>
                             <a:fillRect/>
                           </a:stretch>
@@ -20307,7 +20498,7 @@
       <w:tr>
         <w:tc>
           <w:tcPr/>
-          <w:bookmarkStart w:id="49" w:name="tbl-needles-pois"/>
+          <w:bookmarkStart w:id="53" w:name="tbl-needles-pois"/>
           <w:p>
             <w:pPr>
               <w:jc w:val="center"/>
@@ -21300,7 +21491,7 @@
               </w:tc>
             </w:tr>
           </w:tbl>
-          <w:bookmarkEnd w:id="49"/>
+          <w:bookmarkEnd w:id="53"/>
           <w:p/>
         </w:tc>
       </w:tr>
@@ -22596,7 +22787,7 @@
       <w:tr>
         <w:tc>
           <w:tcPr/>
-          <w:bookmarkStart w:id="53" w:name="fig-needles-pois"/>
+          <w:bookmarkStart w:id="57" w:name="fig-needles-pois"/>
           <w:p>
             <w:pPr>
               <w:pStyle w:val="Compact"/>
@@ -22607,18 +22798,18 @@
                 <wp:inline>
                   <wp:extent cx="4620126" cy="3696101"/>
                   <wp:effectExtent b="0" l="0" r="0" t="0"/>
-                  <wp:docPr descr="" title="" id="51" name="Picture"/>
+                  <wp:docPr descr="" title="" id="55" name="Picture"/>
                   <a:graphic>
                     <a:graphicData uri="http://schemas.openxmlformats.org/drawingml/2006/picture">
                       <pic:pic>
                         <pic:nvPicPr>
-                          <pic:cNvPr descr="count-regression_files/figure-docx/fig-needles-pois-1.png" id="52" name="Picture"/>
+                          <pic:cNvPr descr="count-regression_files/figure-docx/fig-needles-pois-1.png" id="56" name="Picture"/>
                           <pic:cNvPicPr>
                             <a:picLocks noChangeArrowheads="1" noChangeAspect="1"/>
                           </pic:cNvPicPr>
                         </pic:nvPicPr>
                         <pic:blipFill>
-                          <a:blip r:embed="rId50"/>
+                          <a:blip r:embed="rId54"/>
                           <a:stretch>
                             <a:fillRect/>
                           </a:stretch>
@@ -22658,12 +22849,12 @@
               <w:t xml:space="preserve">Figure 4: Fitted Poisson model: expected sharing by age and housing status</w:t>
             </w:r>
           </w:p>
-          <w:bookmarkEnd w:id="53"/>
+          <w:bookmarkEnd w:id="57"/>
         </w:tc>
       </w:tr>
     </w:tbl>
-    <w:bookmarkEnd w:id="54"/>
-    <w:bookmarkStart w:id="58" w:name="interpreting-the-coefficients"/>
+    <w:bookmarkEnd w:id="58"/>
+    <w:bookmarkStart w:id="62" w:name="interpreting-the-coefficients"/>
     <w:p>
       <w:pPr>
         <w:pStyle w:val="Heading2"/>
@@ -23837,18 +24028,18 @@
                 <wp:inline>
                   <wp:extent cx="152400" cy="152400"/>
                   <wp:effectExtent b="0" l="0" r="0" t="0"/>
-                  <wp:docPr descr="" title="" id="56" name="Picture"/>
+                  <wp:docPr descr="" title="" id="60" name="Picture"/>
                   <a:graphic>
                     <a:graphicData uri="http://schemas.openxmlformats.org/drawingml/2006/picture">
                       <pic:pic>
                         <pic:nvPicPr>
-                          <pic:cNvPr descr="/opt/quarto/share/formats/docx/warning.png" id="57" name="Picture"/>
+                          <pic:cNvPr descr="/opt/quarto/share/formats/docx/warning.png" id="61" name="Picture"/>
                           <pic:cNvPicPr>
                             <a:picLocks noChangeArrowheads="1" noChangeAspect="1"/>
                           </pic:cNvPicPr>
                         </pic:nvPicPr>
                         <pic:blipFill>
-                          <a:blip r:embed="rId55"/>
+                          <a:blip r:embed="rId59"/>
                           <a:stretch>
                             <a:fillRect/>
                           </a:stretch>
@@ -23936,9 +24127,9 @@
         </w:tc>
       </w:tr>
     </w:tbl>
-    <w:bookmarkEnd w:id="58"/>
-    <w:bookmarkEnd w:id="59"/>
-    <w:bookmarkStart w:id="63" w:name="inference-for-count-regression-models"/>
+    <w:bookmarkEnd w:id="62"/>
+    <w:bookmarkEnd w:id="63"/>
+    <w:bookmarkStart w:id="67" w:name="inference-for-count-regression-models"/>
     <w:p>
       <w:pPr>
         <w:pStyle w:val="Heading1"/>
@@ -23947,7 +24138,7 @@
         <w:t xml:space="preserve">4. Inference for count regression models</w:t>
       </w:r>
     </w:p>
-    <w:bookmarkStart w:id="60" w:name="X6bd24df31c63af7f3ea1ecd1c26c02e2eae7ecf"/>
+    <w:bookmarkStart w:id="64" w:name="X6bd24df31c63af7f3ea1ecd1c26c02e2eae7ecf"/>
     <w:p>
       <w:pPr>
         <w:pStyle w:val="Heading3"/>
@@ -24606,8 +24797,8 @@
         </m:oMath>
       </m:oMathPara>
     </w:p>
-    <w:bookmarkEnd w:id="60"/>
-    <w:bookmarkStart w:id="61" w:name="Xeb12adf54a36cf7698b86f98d5bc1ca5c39dc0e"/>
+    <w:bookmarkEnd w:id="64"/>
+    <w:bookmarkStart w:id="65" w:name="Xeb12adf54a36cf7698b86f98d5bc1ca5c39dc0e"/>
     <w:p>
       <w:pPr>
         <w:pStyle w:val="Heading3"/>
@@ -24953,8 +25144,8 @@
         <w:t xml:space="preserve">has no association with the outcome rate.</w:t>
       </w:r>
     </w:p>
-    <w:bookmarkEnd w:id="61"/>
-    <w:bookmarkStart w:id="62" w:name="comparing-nested-models"/>
+    <w:bookmarkEnd w:id="65"/>
+    <w:bookmarkStart w:id="66" w:name="comparing-nested-models"/>
     <w:p>
       <w:pPr>
         <w:pStyle w:val="Heading3"/>
@@ -25481,9 +25672,9 @@
         <w:t xml:space="preserve">for details.</w:t>
       </w:r>
     </w:p>
-    <w:bookmarkEnd w:id="62"/>
-    <w:bookmarkEnd w:id="63"/>
-    <w:bookmarkStart w:id="64" w:name="prediction"/>
+    <w:bookmarkEnd w:id="66"/>
+    <w:bookmarkEnd w:id="67"/>
+    <w:bookmarkStart w:id="68" w:name="prediction"/>
     <w:p>
       <w:pPr>
         <w:pStyle w:val="Heading1"/>
@@ -26054,8 +26245,8 @@
         </m:oMath>
       </m:oMathPara>
     </w:p>
-    <w:bookmarkEnd w:id="64"/>
-    <w:bookmarkStart w:id="78" w:name="diagnostics"/>
+    <w:bookmarkEnd w:id="68"/>
+    <w:bookmarkStart w:id="82" w:name="diagnostics"/>
     <w:p>
       <w:pPr>
         <w:pStyle w:val="Heading1"/>
@@ -26064,7 +26255,7 @@
         <w:t xml:space="preserve">6. Diagnostics</w:t>
       </w:r>
     </w:p>
-    <w:bookmarkStart w:id="77" w:name="residuals"/>
+    <w:bookmarkStart w:id="81" w:name="residuals"/>
     <w:p>
       <w:pPr>
         <w:pStyle w:val="Heading3"/>
@@ -26073,7 +26264,7 @@
         <w:t xml:space="preserve">6.0.1 Residuals</w:t>
       </w:r>
     </w:p>
-    <w:bookmarkStart w:id="65" w:name="observation-residuals"/>
+    <w:bookmarkStart w:id="69" w:name="observation-residuals"/>
     <w:p>
       <w:pPr>
         <w:pStyle w:val="Heading4"/>
@@ -26162,8 +26353,8 @@
         </m:oMath>
       </m:oMathPara>
     </w:p>
-    <w:bookmarkEnd w:id="65"/>
-    <w:bookmarkStart w:id="66" w:name="pearson-residuals"/>
+    <w:bookmarkEnd w:id="69"/>
+    <w:bookmarkStart w:id="70" w:name="pearson-residuals"/>
     <w:p>
       <w:pPr>
         <w:pStyle w:val="Heading4"/>
@@ -26324,8 +26515,8 @@
         </m:oMath>
       </m:oMathPara>
     </w:p>
-    <w:bookmarkEnd w:id="66"/>
-    <w:bookmarkStart w:id="68" w:name="standardized-pearson-residuals"/>
+    <w:bookmarkEnd w:id="70"/>
+    <w:bookmarkStart w:id="72" w:name="standardized-pearson-residuals"/>
     <w:p>
       <w:pPr>
         <w:pStyle w:val="Heading4"/>
@@ -26469,7 +26660,7 @@
       <w:r>
         <w:t xml:space="preserve"> </w:t>
       </w:r>
-      <w:hyperlink r:id="rId67">
+      <w:hyperlink r:id="rId71">
         <w:r>
           <w:rPr>
             <w:rStyle w:val="Hyperlink"/>
@@ -26569,8 +26760,8 @@
         <w:t xml:space="preserve">which here we take to be the individual observations.</w:t>
       </w:r>
     </w:p>
-    <w:bookmarkEnd w:id="68"/>
-    <w:bookmarkStart w:id="76" w:name="deviance-residuals"/>
+    <w:bookmarkEnd w:id="72"/>
+    <w:bookmarkStart w:id="80" w:name="deviance-residuals"/>
     <w:p>
       <w:pPr>
         <w:pStyle w:val="Heading4"/>
@@ -26841,18 +27032,18 @@
                 <wp:inline>
                   <wp:extent cx="152400" cy="152400"/>
                   <wp:effectExtent b="0" l="0" r="0" t="0"/>
-                  <wp:docPr descr="" title="" id="70" name="Picture"/>
+                  <wp:docPr descr="" title="" id="74" name="Picture"/>
                   <a:graphic>
                     <a:graphicData uri="http://schemas.openxmlformats.org/drawingml/2006/picture">
                       <pic:pic>
                         <pic:nvPicPr>
-                          <pic:cNvPr descr="/opt/quarto/share/formats/docx/note.png" id="71" name="Picture"/>
+                          <pic:cNvPr descr="/opt/quarto/share/formats/docx/note.png" id="75" name="Picture"/>
                           <pic:cNvPicPr>
                             <a:picLocks noChangeArrowheads="1" noChangeAspect="1"/>
                           </pic:cNvPicPr>
                         </pic:nvPicPr>
                         <pic:blipFill>
-                          <a:blip r:embed="rId69"/>
+                          <a:blip r:embed="rId73"/>
                           <a:stretch>
                             <a:fillRect/>
                           </a:stretch>
@@ -27319,7 +27510,7 @@
       <w:tr>
         <w:tc>
           <w:tcPr/>
-          <w:bookmarkStart w:id="75" w:name="tbl-pois-model-diagnostics"/>
+          <w:bookmarkStart w:id="79" w:name="tbl-pois-model-diagnostics"/>
           <w:p>
             <w:pPr>
               <w:jc w:val="center"/>
@@ -27342,18 +27533,18 @@
                 <wp:inline>
                   <wp:extent cx="4620126" cy="3696101"/>
                   <wp:effectExtent b="0" l="0" r="0" t="0"/>
-                  <wp:docPr descr="" title="" id="73" name="Picture"/>
+                  <wp:docPr descr="" title="" id="77" name="Picture"/>
                   <a:graphic>
                     <a:graphicData uri="http://schemas.openxmlformats.org/drawingml/2006/picture">
                       <pic:pic>
                         <pic:nvPicPr>
-                          <pic:cNvPr descr="count-regression_files/figure-docx/tbl-pois-model-diagnostics-1.png" id="74" name="Picture"/>
+                          <pic:cNvPr descr="count-regression_files/figure-docx/tbl-pois-model-diagnostics-1.png" id="78" name="Picture"/>
                           <pic:cNvPicPr>
                             <a:picLocks noChangeArrowheads="1" noChangeAspect="1"/>
                           </pic:cNvPicPr>
                         </pic:nvPicPr>
                         <pic:blipFill>
-                          <a:blip r:embed="rId72"/>
+                          <a:blip r:embed="rId76"/>
                           <a:stretch>
                             <a:fillRect/>
                           </a:stretch>
@@ -27380,14 +27571,14 @@
               </w:drawing>
             </w:r>
           </w:p>
-          <w:bookmarkEnd w:id="75"/>
+          <w:bookmarkEnd w:id="79"/>
         </w:tc>
       </w:tr>
     </w:tbl>
-    <w:bookmarkEnd w:id="76"/>
-    <w:bookmarkEnd w:id="77"/>
-    <w:bookmarkEnd w:id="78"/>
-    <w:bookmarkStart w:id="82" w:name="zero-inflation"/>
+    <w:bookmarkEnd w:id="80"/>
+    <w:bookmarkEnd w:id="81"/>
+    <w:bookmarkEnd w:id="82"/>
+    <w:bookmarkStart w:id="86" w:name="zero-inflation"/>
     <w:p>
       <w:pPr>
         <w:pStyle w:val="Heading1"/>
@@ -27396,7 +27587,7 @@
         <w:t xml:space="preserve">7. Zero-inflation</w:t>
       </w:r>
     </w:p>
-    <w:bookmarkStart w:id="81" w:name="models-for-zero-inflated-counts"/>
+    <w:bookmarkStart w:id="85" w:name="models-for-zero-inflated-counts"/>
     <w:p>
       <w:pPr>
         <w:pStyle w:val="Heading3"/>
@@ -29348,7 +29539,7 @@
               <w:spacing w:before="16" w:after="64"/>
             </w:pPr>
           </w:p>
-          <w:bookmarkStart w:id="79" w:name="exr-zinf-pmf"/>
+          <w:bookmarkStart w:id="83" w:name="exr-zinf-pmf"/>
           <w:p>
             <w:pPr>
               <w:pStyle w:val="BodyText"/>
@@ -29674,7 +29865,7 @@
               <w:t xml:space="preserve">.</w:t>
             </w:r>
           </w:p>
-          <w:bookmarkEnd w:id="79"/>
+          <w:bookmarkEnd w:id="83"/>
         </w:tc>
       </w:tr>
     </w:tbl>
@@ -32299,7 +32490,7 @@
               <w:spacing w:before="16" w:after="64"/>
             </w:pPr>
           </w:p>
-          <w:bookmarkStart w:id="80" w:name="exr-zinf-moments"/>
+          <w:bookmarkStart w:id="84" w:name="exr-zinf-moments"/>
           <w:p>
             <w:pPr>
               <w:pStyle w:val="BodyText"/>
@@ -32432,7 +32623,7 @@
               <w:t xml:space="preserve">.</w:t>
             </w:r>
           </w:p>
-          <w:bookmarkEnd w:id="80"/>
+          <w:bookmarkEnd w:id="84"/>
         </w:tc>
       </w:tr>
     </w:tbl>
@@ -36197,9 +36388,9 @@
         </w:tc>
       </w:tr>
     </w:tbl>
-    <w:bookmarkEnd w:id="81"/>
-    <w:bookmarkEnd w:id="82"/>
-    <w:bookmarkStart w:id="98" w:name="over-dispersion"/>
+    <w:bookmarkEnd w:id="85"/>
+    <w:bookmarkEnd w:id="86"/>
+    <w:bookmarkStart w:id="102" w:name="over-dispersion"/>
     <w:p>
       <w:pPr>
         <w:pStyle w:val="Heading1"/>
@@ -36464,7 +36655,7 @@
               <w:spacing w:before="16" w:after="64"/>
             </w:pPr>
           </w:p>
-          <w:bookmarkStart w:id="83" w:name="def-overdispersion"/>
+          <w:bookmarkStart w:id="87" w:name="def-overdispersion"/>
           <w:p>
             <w:pPr>
               <w:pStyle w:val="BodyText"/>
@@ -37392,7 +37583,7 @@
               <w:t xml:space="preserve">model predicts.</w:t>
             </w:r>
           </w:p>
-          <w:bookmarkEnd w:id="83"/>
+          <w:bookmarkEnd w:id="87"/>
         </w:tc>
       </w:tr>
     </w:tbl>
@@ -37642,7 +37833,7 @@
       <w:r>
         <w:t xml:space="preserve"> </w:t>
       </w:r>
-      <w:hyperlink r:id="rId84">
+      <w:hyperlink r:id="rId88">
         <w:r>
           <w:rPr>
             <w:rStyle w:val="Hyperlink"/>
@@ -37702,18 +37893,18 @@
                 <wp:inline>
                   <wp:extent cx="152400" cy="152400"/>
                   <wp:effectExtent b="0" l="0" r="0" t="0"/>
-                  <wp:docPr descr="" title="" id="85" name="Picture"/>
+                  <wp:docPr descr="" title="" id="89" name="Picture"/>
                   <a:graphic>
                     <a:graphicData uri="http://schemas.openxmlformats.org/drawingml/2006/picture">
                       <pic:pic>
                         <pic:nvPicPr>
-                          <pic:cNvPr descr="/opt/quarto/share/formats/docx/note.png" id="86" name="Picture"/>
+                          <pic:cNvPr descr="/opt/quarto/share/formats/docx/note.png" id="90" name="Picture"/>
                           <pic:cNvPicPr>
                             <a:picLocks noChangeArrowheads="1" noChangeAspect="1"/>
                           </pic:cNvPicPr>
                         </pic:nvPicPr>
                         <pic:blipFill>
-                          <a:blip r:embed="rId69"/>
+                          <a:blip r:embed="rId73"/>
                           <a:stretch>
                             <a:fillRect/>
                           </a:stretch>
@@ -37866,7 +38057,7 @@
         </w:pict>
       </w:r>
     </w:p>
-    <w:bookmarkStart w:id="96" w:name="negative-binomial-models"/>
+    <w:bookmarkStart w:id="100" w:name="negative-binomial-models"/>
     <w:p>
       <w:pPr>
         <w:pStyle w:val="Heading2"/>
@@ -37897,7 +38088,7 @@
       <w:r>
         <w:t xml:space="preserve"> </w:t>
       </w:r>
-      <w:hyperlink r:id="rId87">
+      <w:hyperlink r:id="rId91">
         <w:r>
           <w:rPr>
             <w:rStyle w:val="Hyperlink"/>
@@ -38113,7 +38304,7 @@
       <w:r>
         <w:t xml:space="preserve"> </w:t>
       </w:r>
-      <w:hyperlink r:id="rId87">
+      <w:hyperlink r:id="rId91">
         <w:r>
           <w:rPr>
             <w:rStyle w:val="Hyperlink"/>
@@ -38482,7 +38673,7 @@
         </w:pict>
       </w:r>
     </w:p>
-    <w:bookmarkStart w:id="95" w:name="example-needle-sharing-model-extensions"/>
+    <w:bookmarkStart w:id="99" w:name="example-needle-sharing-model-extensions"/>
     <w:p>
       <w:pPr>
         <w:pStyle w:val="Heading3"/>
@@ -39342,7 +39533,7 @@
       <w:tr>
         <w:tc>
           <w:tcPr/>
-          <w:bookmarkStart w:id="88" w:name="tbl-needles-nb"/>
+          <w:bookmarkStart w:id="92" w:name="tbl-needles-nb"/>
           <w:p>
             <w:pPr>
               <w:jc w:val="center"/>
@@ -39707,7 +39898,7 @@
               <w:t xml:space="preserve">#&gt;  2 x log-likelihood:  -237.5430</w:t>
             </w:r>
           </w:p>
-          <w:bookmarkEnd w:id="88"/>
+          <w:bookmarkEnd w:id="92"/>
         </w:tc>
       </w:tr>
     </w:tbl>
@@ -40149,7 +40340,7 @@
       <w:tr>
         <w:tc>
           <w:tcPr/>
-          <w:bookmarkStart w:id="89" w:name="tbl-compare-poisson-nb"/>
+          <w:bookmarkStart w:id="93" w:name="tbl-compare-poisson-nb"/>
           <w:p>
             <w:pPr>
               <w:jc w:val="center"/>
@@ -40985,12 +41176,12 @@
               </w:tc>
             </w:tr>
           </w:tbl>
-          <w:bookmarkEnd w:id="89"/>
+          <w:bookmarkEnd w:id="93"/>
           <w:p/>
         </w:tc>
       </w:tr>
     </w:tbl>
-    <w:bookmarkStart w:id="92" w:name="zero-inflated-models-for-needle-sharing"/>
+    <w:bookmarkStart w:id="96" w:name="zero-inflated-models-for-needle-sharing"/>
     <w:p>
       <w:pPr>
         <w:pStyle w:val="Heading4"/>
@@ -41418,7 +41609,7 @@
       <w:tr>
         <w:tc>
           <w:tcPr/>
-          <w:bookmarkStart w:id="90" w:name="tbl-zeroinf-poisson"/>
+          <w:bookmarkStart w:id="94" w:name="tbl-zeroinf-poisson"/>
           <w:p>
             <w:pPr>
               <w:jc w:val="center"/>
@@ -42698,7 +42889,7 @@
               </w:tc>
             </w:tr>
           </w:tbl>
-          <w:bookmarkEnd w:id="90"/>
+          <w:bookmarkEnd w:id="94"/>
           <w:p/>
         </w:tc>
       </w:tr>
@@ -42713,7 +42904,7 @@
       <w:r>
         <w:t xml:space="preserve"> </w:t>
       </w:r>
-      <w:hyperlink r:id="rId91">
+      <w:hyperlink r:id="rId95">
         <w:r>
           <w:rPr>
             <w:rStyle w:val="VerbatimChar"/>
@@ -42734,8 +42925,8 @@
         <w:t xml:space="preserve">).</w:t>
       </w:r>
     </w:p>
-    <w:bookmarkEnd w:id="92"/>
-    <w:bookmarkStart w:id="94" w:name="zero-inflated-negative-binomial-model"/>
+    <w:bookmarkEnd w:id="96"/>
+    <w:bookmarkStart w:id="98" w:name="zero-inflated-negative-binomial-model"/>
     <w:p>
       <w:pPr>
         <w:pStyle w:val="Heading4"/>
@@ -43100,7 +43291,7 @@
       <w:tr>
         <w:tc>
           <w:tcPr/>
-          <w:bookmarkStart w:id="93" w:name="tbl-zeroinf-nb"/>
+          <w:bookmarkStart w:id="97" w:name="tbl-zeroinf-nb"/>
           <w:p>
             <w:pPr>
               <w:jc w:val="center"/>
@@ -44495,7 +44686,7 @@
               </w:tc>
             </w:tr>
           </w:tbl>
-          <w:bookmarkEnd w:id="93"/>
+          <w:bookmarkEnd w:id="97"/>
           <w:p/>
         </w:tc>
       </w:tr>
@@ -44636,10 +44827,10 @@
         <w:t xml:space="preserve">Keeping the submodel small avoids that.</w:t>
       </w:r>
     </w:p>
-    <w:bookmarkEnd w:id="94"/>
-    <w:bookmarkEnd w:id="95"/>
-    <w:bookmarkEnd w:id="96"/>
-    <w:bookmarkStart w:id="97" w:name="quasipoisson-regression"/>
+    <w:bookmarkEnd w:id="98"/>
+    <w:bookmarkEnd w:id="99"/>
+    <w:bookmarkEnd w:id="100"/>
+    <w:bookmarkStart w:id="101" w:name="quasipoisson-regression"/>
     <w:p>
       <w:pPr>
         <w:pStyle w:val="Heading2"/>
@@ -45200,9 +45391,9 @@
         <w:t xml:space="preserve">in R for implementation details.</w:t>
       </w:r>
     </w:p>
-    <w:bookmarkEnd w:id="97"/>
-    <w:bookmarkEnd w:id="98"/>
-    <w:bookmarkStart w:id="100" w:name="more-on-count-regression"/>
+    <w:bookmarkEnd w:id="101"/>
+    <w:bookmarkEnd w:id="102"/>
+    <w:bookmarkStart w:id="104" w:name="more-on-count-regression"/>
     <w:p>
       <w:pPr>
         <w:pStyle w:val="Heading1"/>
@@ -45219,7 +45410,7 @@
           <w:numId w:val="1006"/>
         </w:numPr>
       </w:pPr>
-      <w:hyperlink r:id="rId99">
+      <w:hyperlink r:id="rId103">
         <w:r>
           <w:rPr>
             <w:rStyle w:val="Hyperlink"/>
@@ -45228,8 +45419,8 @@
         </w:r>
       </w:hyperlink>
     </w:p>
-    <w:bookmarkEnd w:id="100"/>
-    <w:bookmarkStart w:id="104" w:name="exercises"/>
+    <w:bookmarkEnd w:id="104"/>
+    <w:bookmarkStart w:id="108" w:name="exercises"/>
     <w:p>
       <w:pPr>
         <w:pStyle w:val="Heading1"/>
@@ -45272,7 +45463,7 @@
               <w:spacing w:before="16" w:after="64"/>
             </w:pPr>
           </w:p>
-          <w:bookmarkStart w:id="101" w:name="exr-prac-glm-interp"/>
+          <w:bookmarkStart w:id="105" w:name="exr-prac-glm-interp"/>
           <w:p>
             <w:pPr>
               <w:pStyle w:val="BodyText"/>
@@ -45867,7 +46058,7 @@
               <w:t xml:space="preserve">.</w:t>
             </w:r>
           </w:p>
-          <w:bookmarkEnd w:id="101"/>
+          <w:bookmarkEnd w:id="105"/>
         </w:tc>
       </w:tr>
     </w:tbl>
@@ -47224,7 +47415,7 @@
               <w:spacing w:before="16" w:after="64"/>
             </w:pPr>
           </w:p>
-          <w:bookmarkStart w:id="102" w:name="exr-prac-glm-score"/>
+          <w:bookmarkStart w:id="106" w:name="exr-prac-glm-score"/>
           <w:p>
             <w:pPr>
               <w:pStyle w:val="BodyText"/>
@@ -47756,7 +47947,7 @@
               <w:t xml:space="preserve">do they imply?</w:t>
             </w:r>
           </w:p>
-          <w:bookmarkEnd w:id="102"/>
+          <w:bookmarkEnd w:id="106"/>
         </w:tc>
       </w:tr>
     </w:tbl>
@@ -49724,7 +49915,7 @@
               </w:rPr>
               <w:t xml:space="preserve"> </w:t>
             </w:r>
-            <w:hyperlink r:id="rId103">
+            <w:hyperlink r:id="rId107">
               <w:r>
                 <w:rPr>
                   <w:rStyle w:val="Hyperlink"/>
@@ -50118,8 +50309,8 @@
         </w:tc>
       </w:tr>
     </w:tbl>
-    <w:bookmarkEnd w:id="104"/>
-    <w:bookmarkStart w:id="116" w:name="references"/>
+    <w:bookmarkEnd w:id="108"/>
+    <w:bookmarkStart w:id="122" w:name="references"/>
     <w:p>
       <w:pPr>
         <w:pStyle w:val="Heading1"/>
@@ -50128,8 +50319,8 @@
         <w:t xml:space="preserve">References</w:t>
       </w:r>
     </w:p>
-    <w:bookmarkStart w:id="115" w:name="refs"/>
-    <w:bookmarkStart w:id="106" w:name="ref-dobson4e"/>
+    <w:bookmarkStart w:id="121" w:name="refs"/>
+    <w:bookmarkStart w:id="110" w:name="ref-dobson4e"/>
     <w:p>
       <w:pPr>
         <w:pStyle w:val="Bibliography"/>
@@ -50153,7 +50344,7 @@
       <w:r>
         <w:t xml:space="preserve"> </w:t>
       </w:r>
-      <w:hyperlink r:id="rId105">
+      <w:hyperlink r:id="rId109">
         <w:r>
           <w:rPr>
             <w:rStyle w:val="Hyperlink"/>
@@ -50165,8 +50356,8 @@
         <w:t xml:space="preserve">.</w:t>
       </w:r>
     </w:p>
-    <w:bookmarkEnd w:id="106"/>
-    <w:bookmarkStart w:id="108" w:name="ref-dunn2018generalized"/>
+    <w:bookmarkEnd w:id="110"/>
+    <w:bookmarkStart w:id="112" w:name="ref-dunn2018generalized"/>
     <w:p>
       <w:pPr>
         <w:pStyle w:val="Bibliography"/>
@@ -50204,7 +50395,7 @@
       <w:r>
         <w:t xml:space="preserve"> </w:t>
       </w:r>
-      <w:hyperlink r:id="rId107">
+      <w:hyperlink r:id="rId111">
         <w:r>
           <w:rPr>
             <w:rStyle w:val="Hyperlink"/>
@@ -50216,41 +50407,14 @@
         <w:t xml:space="preserve">.</w:t>
       </w:r>
     </w:p>
-    <w:bookmarkEnd w:id="108"/>
-    <w:bookmarkStart w:id="110" w:name="ref-tsui2009hcv"/>
+    <w:bookmarkEnd w:id="112"/>
+    <w:bookmarkStart w:id="114" w:name="ref-rocke2021epi204"/>
     <w:p>
       <w:pPr>
         <w:pStyle w:val="Bibliography"/>
       </w:pPr>
       <w:r>
-        <w:t xml:space="preserve">Tsui, Judith I., Eric Vittinghoff, Judith A. Hahn, Jennifer L. Evans, Peter J. Davidson, and Kimberly Page. 2009.</w:t>
-      </w:r>
-      <w:r>
-        <w:t xml:space="preserve"> </w:t>
-      </w:r>
-      <w:r>
-        <w:t xml:space="preserve">“Risk Behaviors After Hepatitis</w:t>
-      </w:r>
-      <w:r>
-        <w:t xml:space="preserve"> </w:t>
-      </w:r>
-      <w:r>
-        <w:t xml:space="preserve">C</w:t>
-      </w:r>
-      <w:r>
-        <w:t xml:space="preserve"> </w:t>
-      </w:r>
-      <w:r>
-        <w:t xml:space="preserve">Virus Seroconversion in Young Injection Drug Users in</w:t>
-      </w:r>
-      <w:r>
-        <w:t xml:space="preserve"> </w:t>
-      </w:r>
-      <w:r>
-        <w:t xml:space="preserve">San Francisco</w:t>
-      </w:r>
-      <w:r>
-        <w:t xml:space="preserve">.”</w:t>
+        <w:t xml:space="preserve">Rocke, David M. 2021.</w:t>
       </w:r>
       <w:r>
         <w:t xml:space="preserve"> </w:t>
@@ -50260,6 +50424,112 @@
           <w:i/>
           <w:iCs/>
         </w:rPr>
+        <w:t xml:space="preserve">Epi</w:t>
+      </w:r>
+      <w:r>
+        <w:rPr>
+          <w:i/>
+          <w:iCs/>
+        </w:rPr>
+        <w:t xml:space="preserve"> </w:t>
+      </w:r>
+      <w:r>
+        <w:rPr>
+          <w:i/>
+          <w:iCs/>
+        </w:rPr>
+        <w:t xml:space="preserve">204 Lecture Notes,</w:t>
+      </w:r>
+      <w:r>
+        <w:rPr>
+          <w:i/>
+          <w:iCs/>
+        </w:rPr>
+        <w:t xml:space="preserve"> </w:t>
+      </w:r>
+      <w:r>
+        <w:rPr>
+          <w:i/>
+          <w:iCs/>
+        </w:rPr>
+        <w:t xml:space="preserve">Spring</w:t>
+      </w:r>
+      <w:r>
+        <w:rPr>
+          <w:i/>
+          <w:iCs/>
+        </w:rPr>
+        <w:t xml:space="preserve"> </w:t>
+      </w:r>
+      <w:r>
+        <w:rPr>
+          <w:i/>
+          <w:iCs/>
+        </w:rPr>
+        <w:t xml:space="preserve">2021</w:t>
+      </w:r>
+      <w:r>
+        <w:t xml:space="preserve">. University of California, Davis.</w:t>
+      </w:r>
+      <w:r>
+        <w:t xml:space="preserve"> </w:t>
+      </w:r>
+      <w:hyperlink r:id="rId113">
+        <w:r>
+          <w:rPr>
+            <w:rStyle w:val="Hyperlink"/>
+          </w:rPr>
+          <w:t xml:space="preserve">https://dmrocke.ucdavis.edu/Class/EPI204-Spring-2021/EPI204-Spring-2021.html</w:t>
+        </w:r>
+      </w:hyperlink>
+      <w:r>
+        <w:t xml:space="preserve">.</w:t>
+      </w:r>
+    </w:p>
+    <w:bookmarkEnd w:id="114"/>
+    <w:bookmarkStart w:id="116" w:name="ref-tsui2009hcv"/>
+    <w:p>
+      <w:pPr>
+        <w:pStyle w:val="Bibliography"/>
+      </w:pPr>
+      <w:r>
+        <w:t xml:space="preserve">Tsui, Judith I., Eric Vittinghoff, Judith A. Hahn, Jennifer L. Evans, Peter J. Davidson, and Kimberly Page. 2009.</w:t>
+      </w:r>
+      <w:r>
+        <w:t xml:space="preserve"> </w:t>
+      </w:r>
+      <w:r>
+        <w:t xml:space="preserve">“Risk Behaviors After Hepatitis</w:t>
+      </w:r>
+      <w:r>
+        <w:t xml:space="preserve"> </w:t>
+      </w:r>
+      <w:r>
+        <w:t xml:space="preserve">C</w:t>
+      </w:r>
+      <w:r>
+        <w:t xml:space="preserve"> </w:t>
+      </w:r>
+      <w:r>
+        <w:t xml:space="preserve">Virus Seroconversion in Young Injection Drug Users in</w:t>
+      </w:r>
+      <w:r>
+        <w:t xml:space="preserve"> </w:t>
+      </w:r>
+      <w:r>
+        <w:t xml:space="preserve">San Francisco</w:t>
+      </w:r>
+      <w:r>
+        <w:t xml:space="preserve">.”</w:t>
+      </w:r>
+      <w:r>
+        <w:t xml:space="preserve"> </w:t>
+      </w:r>
+      <w:r>
+        <w:rPr>
+          <w:i/>
+          <w:iCs/>
+        </w:rPr>
         <w:t xml:space="preserve">Drug and Alcohol Dependence</w:t>
       </w:r>
       <w:r>
@@ -50271,7 +50541,7 @@
       <w:r>
         <w:t xml:space="preserve"> </w:t>
       </w:r>
-      <w:hyperlink r:id="rId109">
+      <w:hyperlink r:id="rId115">
         <w:r>
           <w:rPr>
             <w:rStyle w:val="Hyperlink"/>
@@ -50283,8 +50553,8 @@
         <w:t xml:space="preserve">.</w:t>
       </w:r>
     </w:p>
-    <w:bookmarkEnd w:id="110"/>
-    <w:bookmarkStart w:id="112" w:name="ref-vittinghoff2e"/>
+    <w:bookmarkEnd w:id="116"/>
+    <w:bookmarkStart w:id="118" w:name="ref-vittinghoff2e"/>
     <w:p>
       <w:pPr>
         <w:pStyle w:val="Bibliography"/>
@@ -50308,7 +50578,7 @@
       <w:r>
         <w:t xml:space="preserve"> </w:t>
       </w:r>
-      <w:hyperlink r:id="rId111">
+      <w:hyperlink r:id="rId117">
         <w:r>
           <w:rPr>
             <w:rStyle w:val="Hyperlink"/>
@@ -50320,8 +50590,8 @@
         <w:t xml:space="preserve">.</w:t>
       </w:r>
     </w:p>
-    <w:bookmarkEnd w:id="112"/>
-    <w:bookmarkStart w:id="114" w:name="ref-pscl08"/>
+    <w:bookmarkEnd w:id="118"/>
+    <w:bookmarkStart w:id="120" w:name="ref-pscl08"/>
     <w:p>
       <w:pPr>
         <w:pStyle w:val="Bibliography"/>
@@ -50363,7 +50633,7 @@
       <w:r>
         <w:t xml:space="preserve"> </w:t>
       </w:r>
-      <w:hyperlink r:id="rId113">
+      <w:hyperlink r:id="rId119">
         <w:r>
           <w:rPr>
             <w:rStyle w:val="Hyperlink"/>
@@ -50375,9 +50645,9 @@
         <w:t xml:space="preserve">.</w:t>
       </w:r>
     </w:p>
-    <w:bookmarkEnd w:id="114"/>
-    <w:bookmarkEnd w:id="115"/>
-    <w:bookmarkEnd w:id="116"/>
+    <w:bookmarkEnd w:id="120"/>
+    <w:bookmarkEnd w:id="121"/>
+    <w:bookmarkEnd w:id="122"/>
     <w:sectPr>
       <w:footnotePr>
         <w:numRestart w:val="eachSect"/>

</xml_diff>